<commit_message>
Se empieza con el tema 2 de cloud.
</commit_message>
<xml_diff>
--- a/MODULO_OPTATIVO_CLOUD/TEMA-01/RESUMEN-CLO-T01.docx
+++ b/MODULO_OPTATIVO_CLOUD/TEMA-01/RESUMEN-CLO-T01.docx
@@ -247,10 +247,17 @@
     </w:p>
     <w:p>
       <w:pPr>
-        <w:pStyle w:val="Ttulo2"/>
         <w:ind w:left="0"/>
-      </w:pPr>
-      <w:r>
+        <w:rPr>
+          <w:b/>
+          <w:bCs/>
+        </w:rPr>
+      </w:pPr>
+      <w:r>
+        <w:rPr>
+          <w:b/>
+          <w:bCs/>
+        </w:rPr>
         <w:t>¿Qué debemos entender realmente cuando hablamos de computación en la nube?</w:t>
       </w:r>
     </w:p>
@@ -672,6 +679,7 @@
     <w:p>
       <w:pPr>
         <w:spacing w:before="100" w:beforeAutospacing="1" w:after="100" w:afterAutospacing="1" w:line="240" w:lineRule="auto"/>
+        <w:ind w:left="0"/>
         <w:rPr>
           <w:rFonts w:eastAsia="Times New Roman" w:cs="Times New Roman"/>
           <w:szCs w:val="24"/>
@@ -722,16 +730,6 @@
           </wp:inline>
         </w:drawing>
       </w:r>
-    </w:p>
-    <w:p>
-      <w:pPr>
-        <w:spacing w:before="100" w:beforeAutospacing="1" w:after="100" w:afterAutospacing="1" w:line="240" w:lineRule="auto"/>
-        <w:rPr>
-          <w:rFonts w:eastAsia="Times New Roman" w:cs="Times New Roman"/>
-          <w:szCs w:val="24"/>
-          <w:lang w:eastAsia="es-ES"/>
-        </w:rPr>
-      </w:pPr>
       <w:r>
         <w:rPr>
           <w:rFonts w:eastAsia="Times New Roman" w:cs="Times New Roman"/>
@@ -784,16 +782,6 @@
           </wp:inline>
         </w:drawing>
       </w:r>
-    </w:p>
-    <w:p>
-      <w:pPr>
-        <w:spacing w:before="100" w:beforeAutospacing="1" w:after="100" w:afterAutospacing="1" w:line="240" w:lineRule="auto"/>
-        <w:rPr>
-          <w:rFonts w:eastAsia="Times New Roman" w:cs="Times New Roman"/>
-          <w:szCs w:val="24"/>
-          <w:lang w:eastAsia="es-ES"/>
-        </w:rPr>
-      </w:pPr>
       <w:r>
         <w:rPr>
           <w:rFonts w:eastAsia="Times New Roman" w:cs="Times New Roman"/>
@@ -837,16 +825,6 @@
           </wp:inline>
         </w:drawing>
       </w:r>
-    </w:p>
-    <w:p>
-      <w:pPr>
-        <w:spacing w:before="100" w:beforeAutospacing="1" w:after="100" w:afterAutospacing="1" w:line="240" w:lineRule="auto"/>
-        <w:rPr>
-          <w:rFonts w:eastAsia="Times New Roman" w:cs="Times New Roman"/>
-          <w:szCs w:val="24"/>
-          <w:lang w:eastAsia="es-ES"/>
-        </w:rPr>
-      </w:pPr>
       <w:r>
         <w:rPr>
           <w:rFonts w:eastAsia="Times New Roman" w:cs="Times New Roman"/>
@@ -1040,16 +1018,17 @@
     </w:p>
     <w:p>
       <w:pPr>
-        <w:pStyle w:val="Ttulo3"/>
         <w:ind w:left="0"/>
         <w:rPr>
-          <w:rFonts w:eastAsia="Times New Roman"/>
+          <w:b/>
+          <w:bCs/>
           <w:lang w:eastAsia="es-ES"/>
         </w:rPr>
       </w:pPr>
       <w:r>
         <w:rPr>
-          <w:rFonts w:eastAsia="Times New Roman"/>
+          <w:b/>
+          <w:bCs/>
           <w:lang w:eastAsia="es-ES"/>
         </w:rPr>
         <w:t>¿Qué requisitos debe cumplir un servicio para considerarse computación en la nube?</w:t>
@@ -1217,16 +1196,7 @@
           <w:szCs w:val="24"/>
           <w:lang w:eastAsia="es-ES"/>
         </w:rPr>
-        <w:t xml:space="preserve"> para definir qué es —y qué no es— </w:t>
-      </w:r>
-      <w:r>
-        <w:rPr>
-          <w:rFonts w:eastAsia="Times New Roman" w:cs="Times New Roman"/>
-          <w:szCs w:val="24"/>
-          <w:lang w:eastAsia="es-ES"/>
-        </w:rPr>
-        <w:lastRenderedPageBreak/>
-        <w:t xml:space="preserve">una verdadera solución de </w:t>
+        <w:t xml:space="preserve"> para definir qué es —y qué no es— una verdadera solución de </w:t>
       </w:r>
       <w:r>
         <w:rPr>
@@ -1276,17 +1246,9 @@
       </w:pPr>
       <w:r>
         <w:rPr>
-          <w:rFonts w:ascii="Segoe UI Symbol" w:hAnsi="Segoe UI Symbol" w:cs="Segoe UI Symbol"/>
-        </w:rPr>
-        <w:t>⚙</w:t>
-      </w:r>
-      <w:r>
-        <w:t xml:space="preserve"> </w:t>
-      </w:r>
-      <w:r>
-        <w:rPr>
-          <w:rStyle w:val="Textoennegrita"/>
-        </w:rPr>
+          <w:rStyle w:val="Textoennegrita"/>
+        </w:rPr>
+        <w:lastRenderedPageBreak/>
         <w:t>Autoservicio bajo demanda</w:t>
       </w:r>
       <w:r>
@@ -1321,30 +1283,9 @@
       </w:pPr>
       <w:r>
         <w:rPr>
-          <w:rFonts w:ascii="Segoe UI Symbol" w:hAnsi="Segoe UI Symbol" w:cs="Segoe UI Symbol"/>
-          <w:b/>
-          <w:bCs/>
-        </w:rPr>
-        <w:t>🌐</w:t>
-      </w:r>
-      <w:r>
-        <w:rPr>
-          <w:b/>
-          <w:bCs/>
-        </w:rPr>
-        <w:t xml:space="preserve"> </w:t>
-      </w:r>
-      <w:r>
-        <w:rPr>
-          <w:rStyle w:val="Textoennegrita"/>
-        </w:rPr>
-        <w:t>Acceso amplio a la red</w:t>
-      </w:r>
-      <w:r>
-        <w:rPr>
-          <w:rStyle w:val="Textoennegrita"/>
-        </w:rPr>
-        <w:t>:</w:t>
+          <w:rStyle w:val="Textoennegrita"/>
+        </w:rPr>
+        <w:t>Acceso amplio a la red:</w:t>
       </w:r>
       <w:r>
         <w:rPr>
@@ -1396,21 +1337,6 @@
       </w:pPr>
       <w:r>
         <w:rPr>
-          <w:rFonts w:ascii="Segoe UI Symbol" w:hAnsi="Segoe UI Symbol" w:cs="Segoe UI Symbol"/>
-          <w:b/>
-          <w:bCs/>
-        </w:rPr>
-        <w:t>🏢</w:t>
-      </w:r>
-      <w:r>
-        <w:rPr>
-          <w:b/>
-          <w:bCs/>
-        </w:rPr>
-        <w:t xml:space="preserve"> </w:t>
-      </w:r>
-      <w:r>
-        <w:rPr>
           <w:rStyle w:val="Textoennegrita"/>
         </w:rPr>
         <w:t>Agrupación de recursos (</w:t>
@@ -1427,13 +1353,7 @@
         <w:rPr>
           <w:rStyle w:val="Textoennegrita"/>
         </w:rPr>
-        <w:t>)</w:t>
-      </w:r>
-      <w:r>
-        <w:rPr>
-          <w:rStyle w:val="Textoennegrita"/>
-        </w:rPr>
-        <w:t>:</w:t>
+        <w:t>):</w:t>
       </w:r>
       <w:r>
         <w:rPr>
@@ -1474,24 +1394,12 @@
       </w:pPr>
       <w:r>
         <w:rPr>
-          <w:rFonts w:ascii="Segoe UI Symbol" w:hAnsi="Segoe UI Symbol" w:cs="Segoe UI Symbol"/>
-        </w:rPr>
-        <w:t>📈</w:t>
-      </w:r>
-      <w:r>
-        <w:t xml:space="preserve"> </w:t>
-      </w:r>
-      <w:r>
-        <w:rPr>
           <w:rStyle w:val="Textoennegrita"/>
         </w:rPr>
         <w:t>Elasticidad rápida y escalabilidad</w:t>
       </w:r>
       <w:r>
-        <w:t xml:space="preserve">: </w:t>
-      </w:r>
-      <w:r>
-        <w:t xml:space="preserve">Los sistemas pueden </w:t>
+        <w:t xml:space="preserve">: Los sistemas pueden </w:t>
       </w:r>
       <w:r>
         <w:rPr>
@@ -1531,24 +1439,12 @@
       </w:pPr>
       <w:r>
         <w:rPr>
-          <w:rFonts w:ascii="Segoe UI Symbol" w:hAnsi="Segoe UI Symbol" w:cs="Segoe UI Symbol"/>
-        </w:rPr>
-        <w:t>📊</w:t>
-      </w:r>
-      <w:r>
-        <w:t xml:space="preserve"> </w:t>
-      </w:r>
-      <w:r>
-        <w:rPr>
           <w:rStyle w:val="Textoennegrita"/>
         </w:rPr>
         <w:t>Medición del servicio (métrica y facturación)</w:t>
       </w:r>
       <w:r>
-        <w:t xml:space="preserve">: </w:t>
-      </w:r>
-      <w:r>
-        <w:t xml:space="preserve">El consumo de recursos (CPU, RAM, almacenamiento, tráfico, etc.) se </w:t>
+        <w:t xml:space="preserve">: El consumo de recursos (CPU, RAM, almacenamiento, tráfico, etc.) se </w:t>
       </w:r>
       <w:r>
         <w:rPr>
@@ -1622,17 +1518,17 @@
     </w:p>
     <w:p>
       <w:pPr>
-        <w:pStyle w:val="Ttulo3"/>
         <w:ind w:left="0"/>
         <w:rPr>
-          <w:rFonts w:eastAsia="Times New Roman"/>
-          <w:b w:val="0"/>
+          <w:b/>
+          <w:bCs/>
           <w:lang w:eastAsia="es-ES"/>
         </w:rPr>
       </w:pPr>
       <w:r>
         <w:rPr>
-          <w:rFonts w:eastAsia="Times New Roman"/>
+          <w:b/>
+          <w:bCs/>
           <w:lang w:eastAsia="es-ES"/>
         </w:rPr>
         <w:t>Debes conocer</w:t>
@@ -1894,7 +1790,6 @@
         <w:ind w:left="0"/>
       </w:pPr>
       <w:r>
-        <w:lastRenderedPageBreak/>
         <w:t>1.2 Evolución y contexto tecnológico.</w:t>
       </w:r>
     </w:p>
@@ -1944,7 +1839,15 @@
           <w:i/>
           <w:iCs/>
         </w:rPr>
-        <w:t xml:space="preserve">, fruto del avance progresivo en áreas como las telecomunicaciones, la virtualización, la capacidad de procesamiento distribuido y el desarrollo de Internet. Este modelo ha transformado por completo la forma en que las personas y las organizaciones </w:t>
+        <w:t xml:space="preserve">, fruto del avance progresivo en áreas como las telecomunicaciones, la virtualización, la capacidad de procesamiento </w:t>
+      </w:r>
+      <w:r>
+        <w:rPr>
+          <w:i/>
+          <w:iCs/>
+        </w:rPr>
+        <w:lastRenderedPageBreak/>
+        <w:t xml:space="preserve">distribuido y el desarrollo de Internet. Este modelo ha transformado por completo la forma en que las personas y las organizaciones </w:t>
       </w:r>
       <w:r>
         <w:rPr>
@@ -2039,10 +1942,17 @@
     </w:p>
     <w:p>
       <w:pPr>
-        <w:pStyle w:val="Ttulo3"/>
         <w:ind w:left="0"/>
-      </w:pPr>
-      <w:r>
+        <w:rPr>
+          <w:b/>
+          <w:bCs/>
+        </w:rPr>
+      </w:pPr>
+      <w:r>
+        <w:rPr>
+          <w:b/>
+          <w:bCs/>
+        </w:rPr>
         <w:t>Evolución tecnológica hacia la computación en la nube</w:t>
       </w:r>
     </w:p>
@@ -2296,7 +2206,6 @@
           <w:szCs w:val="24"/>
           <w:lang w:eastAsia="es-ES"/>
         </w:rPr>
-        <w:lastRenderedPageBreak/>
         <w:t>Trabajo remoto e híbrido</w:t>
       </w:r>
       <w:r>
@@ -2361,6 +2270,7 @@
           <w:szCs w:val="24"/>
           <w:lang w:eastAsia="es-ES"/>
         </w:rPr>
+        <w:lastRenderedPageBreak/>
         <w:t>Uso intensivo de tecnologías emergentes</w:t>
       </w:r>
       <w:r>
@@ -2921,7 +2831,6 @@
           <w:szCs w:val="24"/>
           <w:lang w:eastAsia="es-ES"/>
         </w:rPr>
-        <w:lastRenderedPageBreak/>
         <w:t>Modelos de despliegue (nube pública, privada, híbrida, comunitaria):</w:t>
       </w:r>
       <w:r>
@@ -2967,6 +2876,7 @@
           <w:szCs w:val="24"/>
           <w:lang w:eastAsia="es-ES"/>
         </w:rPr>
+        <w:lastRenderedPageBreak/>
         <w:t xml:space="preserve">La siguiente tabla resume los </w:t>
       </w:r>
       <w:r>
@@ -3080,16 +2990,17 @@
     </w:p>
     <w:p>
       <w:pPr>
-        <w:pStyle w:val="Ttulo3"/>
         <w:ind w:left="0"/>
         <w:rPr>
-          <w:rFonts w:eastAsia="Times New Roman"/>
+          <w:b/>
+          <w:bCs/>
           <w:lang w:eastAsia="es-ES"/>
         </w:rPr>
       </w:pPr>
       <w:r>
         <w:rPr>
-          <w:rFonts w:eastAsia="Times New Roman"/>
+          <w:b/>
+          <w:bCs/>
           <w:lang w:eastAsia="es-ES"/>
         </w:rPr>
         <w:t>Modelos de despliegue</w:t>
@@ -3295,6 +3206,7 @@
     <w:p>
       <w:pPr>
         <w:spacing w:before="100" w:beforeAutospacing="1" w:after="100" w:afterAutospacing="1" w:line="240" w:lineRule="auto"/>
+        <w:ind w:left="0"/>
         <w:rPr>
           <w:rFonts w:eastAsia="Times New Roman" w:cs="Times New Roman"/>
           <w:szCs w:val="24"/>
@@ -3344,16 +3256,6 @@
           </wp:inline>
         </w:drawing>
       </w:r>
-    </w:p>
-    <w:p>
-      <w:pPr>
-        <w:spacing w:before="100" w:beforeAutospacing="1" w:after="100" w:afterAutospacing="1" w:line="240" w:lineRule="auto"/>
-        <w:rPr>
-          <w:rFonts w:eastAsia="Times New Roman" w:cs="Times New Roman"/>
-          <w:szCs w:val="24"/>
-          <w:lang w:eastAsia="es-ES"/>
-        </w:rPr>
-      </w:pPr>
       <w:r>
         <w:rPr>
           <w:rFonts w:eastAsia="Times New Roman" w:cs="Times New Roman"/>
@@ -3401,6 +3303,7 @@
     <w:p>
       <w:pPr>
         <w:spacing w:before="100" w:beforeAutospacing="1" w:after="100" w:afterAutospacing="1" w:line="240" w:lineRule="auto"/>
+        <w:ind w:left="0"/>
         <w:rPr>
           <w:rFonts w:eastAsia="Times New Roman" w:cs="Times New Roman"/>
           <w:szCs w:val="24"/>
@@ -3624,16 +3527,17 @@
     </w:p>
     <w:p>
       <w:pPr>
-        <w:pStyle w:val="Ttulo3"/>
         <w:ind w:left="0"/>
         <w:rPr>
-          <w:rFonts w:eastAsia="Times New Roman"/>
+          <w:b/>
+          <w:bCs/>
           <w:lang w:eastAsia="es-ES"/>
         </w:rPr>
       </w:pPr>
       <w:r>
         <w:rPr>
-          <w:rFonts w:eastAsia="Times New Roman"/>
+          <w:b/>
+          <w:bCs/>
           <w:lang w:eastAsia="es-ES"/>
         </w:rPr>
         <w:t>Ventajas clave de la computación en la nube</w:t>
@@ -3733,6 +3637,7 @@
     </w:p>
     <w:p>
       <w:pPr>
+        <w:ind w:left="0"/>
         <w:rPr>
           <w:b/>
           <w:bCs/>
@@ -3743,307 +3648,223 @@
           <w:b/>
           <w:bCs/>
         </w:rPr>
-        <w:t>1. </w:t>
-      </w:r>
-      <w:r>
-        <w:rPr>
-          <w:rFonts w:ascii="Segoe UI Symbol" w:hAnsi="Segoe UI Symbol" w:cs="Segoe UI Symbol"/>
+        <w:t>1. Elasticidad y escalabilidad automática</w:t>
+      </w:r>
+      <w:r>
+        <w:rPr>
           <w:b/>
           <w:bCs/>
         </w:rPr>
-        <w:t>⚙</w:t>
-      </w:r>
-      <w:r>
+        <w:t xml:space="preserve">: </w:t>
+      </w:r>
+      <w:r>
+        <w:t>Los recursos se ajustan automáticamente según la demanda: se amplían cuando el tráfico aumenta y se reducen en tiempos de baja actividad.</w:t>
+      </w:r>
+      <w:r>
+        <w:br/>
+      </w:r>
+      <w:r>
+        <w:rPr>
+          <w:rStyle w:val="Textoennegrita"/>
+        </w:rPr>
+        <w:t>Ideal para:</w:t>
+      </w:r>
+      <w:r>
+        <w:t xml:space="preserve"> aplicaciones web, comercio electrónico, eventos en vivo.</w:t>
+      </w:r>
+    </w:p>
+    <w:p>
+      <w:pPr>
+        <w:ind w:left="0"/>
         <w:rPr>
           <w:b/>
           <w:bCs/>
         </w:rPr>
-        <w:t xml:space="preserve"> Elasticidad y escalabilidad automática</w:t>
-      </w:r>
+      </w:pPr>
       <w:r>
         <w:rPr>
           <w:b/>
           <w:bCs/>
         </w:rPr>
-        <w:t xml:space="preserve">: </w:t>
-      </w:r>
-      <w:r>
-        <w:t>Los recursos se ajustan automáticamente según la demanda: se amplían cuando el tráfico aumenta y se reducen en tiempos de baja actividad.</w:t>
-      </w:r>
-      <w:r>
-        <w:br/>
-      </w:r>
-      <w:r>
-        <w:rPr>
-          <w:rStyle w:val="Textoennegrita"/>
-        </w:rPr>
-        <w:t>Ideal para:</w:t>
-      </w:r>
-      <w:r>
-        <w:t xml:space="preserve"> aplicaciones web, comercio electrónico, eventos en vivo.</w:t>
-      </w:r>
-    </w:p>
-    <w:p>
-      <w:pPr>
+        <w:t>2. Reducción de costes operativos</w:t>
+      </w:r>
+      <w:r>
         <w:rPr>
           <w:b/>
           <w:bCs/>
         </w:rPr>
-      </w:pPr>
-      <w:r>
+        <w:t xml:space="preserve">: </w:t>
+      </w:r>
+      <w:r>
+        <w:t>Elimina la necesidad de comprar y mantener servidores propios. Solo se paga por el uso real, lo que evita gastos innecesarios.</w:t>
+      </w:r>
+    </w:p>
+    <w:p>
+      <w:pPr>
+        <w:ind w:left="0"/>
         <w:rPr>
           <w:b/>
           <w:bCs/>
         </w:rPr>
-        <w:t>2. </w:t>
-      </w:r>
-      <w:r>
-        <w:rPr>
-          <w:rFonts w:ascii="Segoe UI Symbol" w:hAnsi="Segoe UI Symbol" w:cs="Segoe UI Symbol"/>
+      </w:pPr>
+      <w:r>
+        <w:rPr>
           <w:b/>
           <w:bCs/>
         </w:rPr>
-        <w:t>💰</w:t>
+        <w:t>3.</w:t>
       </w:r>
       <w:r>
         <w:rPr>
           <w:b/>
           <w:bCs/>
         </w:rPr>
-        <w:t> Reducción de costes operativos</w:t>
+        <w:t xml:space="preserve"> </w:t>
       </w:r>
       <w:r>
         <w:rPr>
           <w:b/>
           <w:bCs/>
         </w:rPr>
-        <w:t xml:space="preserve">: </w:t>
-      </w:r>
-      <w:r>
-        <w:t>Elimina la necesidad de comprar y mantener servidores propios. Solo se paga por el uso real, lo que evita gastos innecesarios.</w:t>
-      </w:r>
-    </w:p>
-    <w:p>
-      <w:pPr>
+        <w:t>Alta disponibilidad y continuidad del negocio</w:t>
+      </w:r>
+      <w:r>
         <w:rPr>
           <w:b/>
           <w:bCs/>
         </w:rPr>
-      </w:pPr>
-      <w:r>
+        <w:t xml:space="preserve">: </w:t>
+      </w:r>
+      <w:r>
+        <w:t>Los datos y servicios se replican entre regiones geográficas, permitiendo continuar la operación incluso ante fallos o desastres.</w:t>
+      </w:r>
+    </w:p>
+    <w:p>
+      <w:pPr>
+        <w:ind w:left="0"/>
         <w:rPr>
           <w:b/>
           <w:bCs/>
         </w:rPr>
-        <w:t>3</w:t>
-      </w:r>
+      </w:pPr>
       <w:r>
         <w:rPr>
           <w:b/>
           <w:bCs/>
         </w:rPr>
-        <w:t>. </w:t>
-      </w:r>
-      <w:r>
-        <w:rPr>
-          <w:rFonts w:ascii="Segoe UI Symbol" w:hAnsi="Segoe UI Symbol" w:cs="Segoe UI Symbol"/>
+        <w:t>4. Seguridad integrada y cumplimiento normativo</w:t>
+      </w:r>
+      <w:r>
+        <w:rPr>
           <w:b/>
           <w:bCs/>
         </w:rPr>
-        <w:t>🛡</w:t>
-      </w:r>
-      <w:r>
+        <w:t xml:space="preserve">: </w:t>
+      </w:r>
+      <w:r>
+        <w:t xml:space="preserve">Los proveedores implementan medidas de seguridad avanzadas (encriptación, control de acceso, firewalls) y cumplen con regulaciones internacionales como </w:t>
+      </w:r>
+      <w:r>
+        <w:rPr>
+          <w:rStyle w:val="Textoennegrita"/>
+        </w:rPr>
+        <w:t>ISO 27001, GDPR o HIPAA</w:t>
+      </w:r>
+      <w:r>
+        <w:t>.</w:t>
+      </w:r>
+    </w:p>
+    <w:p>
+      <w:pPr>
+        <w:ind w:left="0"/>
         <w:rPr>
           <w:b/>
           <w:bCs/>
         </w:rPr>
-        <w:t>Alta disponibilidad y continuidad del negocio</w:t>
-      </w:r>
+      </w:pPr>
       <w:r>
         <w:rPr>
           <w:b/>
           <w:bCs/>
         </w:rPr>
-        <w:t xml:space="preserve">: </w:t>
-      </w:r>
-      <w:r>
-        <w:t>Los datos y servicios se replican entre regiones geográficas, permitiendo continuar la operación incluso ante fallos o desastres.</w:t>
-      </w:r>
-    </w:p>
-    <w:p>
-      <w:pPr>
+        <w:lastRenderedPageBreak/>
+        <w:t>5. Acceso remoto y colaboración global</w:t>
+      </w:r>
+      <w:r>
         <w:rPr>
           <w:b/>
           <w:bCs/>
         </w:rPr>
-      </w:pPr>
-      <w:r>
+        <w:t xml:space="preserve">: </w:t>
+      </w:r>
+      <w:r>
+        <w:t xml:space="preserve">Los servicios </w:t>
+      </w:r>
+      <w:proofErr w:type="spellStart"/>
+      <w:r>
+        <w:t>cloud</w:t>
+      </w:r>
+      <w:proofErr w:type="spellEnd"/>
+      <w:r>
+        <w:t xml:space="preserve"> están accesibles desde cualquier parte del mundo, facilitando el trabajo remoto y los equipos distribuidos.</w:t>
+      </w:r>
+    </w:p>
+    <w:p>
+      <w:pPr>
+        <w:ind w:left="0"/>
         <w:rPr>
           <w:b/>
           <w:bCs/>
         </w:rPr>
-        <w:lastRenderedPageBreak/>
-        <w:t>4. Seguri</w:t>
-      </w:r>
+      </w:pPr>
       <w:r>
         <w:rPr>
           <w:b/>
           <w:bCs/>
         </w:rPr>
-        <w:t>d</w:t>
+        <w:t>6. Innovación constante y acceso a tecnologías emergentes</w:t>
       </w:r>
       <w:r>
         <w:rPr>
           <w:b/>
           <w:bCs/>
         </w:rPr>
-        <w:t>ad integrada y cumplimiento normativo</w:t>
-      </w:r>
-      <w:r>
+        <w:t xml:space="preserve">: </w:t>
+      </w:r>
+      <w:r>
+        <w:t xml:space="preserve">La nube ofrece acceso inmediato a servicios de última generación: inteligencia artificial, machine </w:t>
+      </w:r>
+      <w:proofErr w:type="spellStart"/>
+      <w:r>
+        <w:t>learning</w:t>
+      </w:r>
+      <w:proofErr w:type="spellEnd"/>
+      <w:r>
+        <w:t xml:space="preserve">, </w:t>
+      </w:r>
+      <w:proofErr w:type="spellStart"/>
+      <w:r>
+        <w:t>blockchain</w:t>
+      </w:r>
+      <w:proofErr w:type="spellEnd"/>
+      <w:r>
+        <w:t>, realidad aumentada, entre otros.</w:t>
+      </w:r>
+    </w:p>
+    <w:p>
+      <w:pPr>
+        <w:ind w:left="0"/>
         <w:rPr>
           <w:b/>
           <w:bCs/>
         </w:rPr>
-        <w:t xml:space="preserve">: </w:t>
-      </w:r>
-      <w:r>
-        <w:t xml:space="preserve">Los proveedores implementan medidas de seguridad avanzadas (encriptación, control de acceso, firewalls) y cumplen con regulaciones internacionales como </w:t>
-      </w:r>
-      <w:r>
-        <w:rPr>
-          <w:rStyle w:val="Textoennegrita"/>
-        </w:rPr>
-        <w:t>ISO 27001, GDPR o HIPAA</w:t>
-      </w:r>
-      <w:r>
-        <w:t>.</w:t>
-      </w:r>
-    </w:p>
-    <w:p>
-      <w:pPr>
+      </w:pPr>
+      <w:r>
         <w:rPr>
           <w:b/>
           <w:bCs/>
         </w:rPr>
-      </w:pPr>
-      <w:r>
-        <w:rPr>
-          <w:b/>
-          <w:bCs/>
-        </w:rPr>
-        <w:t>5. </w:t>
-      </w:r>
-      <w:r>
-        <w:rPr>
-          <w:rFonts w:ascii="Segoe UI Symbol" w:hAnsi="Segoe UI Symbol" w:cs="Segoe UI Symbol"/>
-          <w:b/>
-          <w:bCs/>
-        </w:rPr>
-        <w:t>🌍</w:t>
-      </w:r>
-      <w:r>
-        <w:rPr>
-          <w:b/>
-          <w:bCs/>
-        </w:rPr>
-        <w:t> Acceso remoto y colaboración global</w:t>
-      </w:r>
-      <w:r>
-        <w:rPr>
-          <w:b/>
-          <w:bCs/>
-        </w:rPr>
-        <w:t xml:space="preserve">: </w:t>
-      </w:r>
-      <w:r>
-        <w:t xml:space="preserve">Los servicios </w:t>
-      </w:r>
-      <w:proofErr w:type="spellStart"/>
-      <w:r>
-        <w:t>cloud</w:t>
-      </w:r>
-      <w:proofErr w:type="spellEnd"/>
-      <w:r>
-        <w:t xml:space="preserve"> están accesibles desde cualquier parte del mundo, facilitando el trabajo remoto y los equipos distribuidos.</w:t>
-      </w:r>
-    </w:p>
-    <w:p>
-      <w:pPr>
-        <w:rPr>
-          <w:b/>
-          <w:bCs/>
-        </w:rPr>
-      </w:pPr>
-      <w:r>
-        <w:rPr>
-          <w:b/>
-          <w:bCs/>
-        </w:rPr>
-        <w:t>6. </w:t>
-      </w:r>
-      <w:r>
-        <w:rPr>
-          <w:rFonts w:ascii="Segoe UI Symbol" w:hAnsi="Segoe UI Symbol" w:cs="Segoe UI Symbol"/>
-          <w:b/>
-          <w:bCs/>
-        </w:rPr>
-        <w:t>🚀</w:t>
-      </w:r>
-      <w:r>
-        <w:rPr>
-          <w:b/>
-          <w:bCs/>
-        </w:rPr>
-        <w:t> Innovación constante y acceso a tecnologías emergentes</w:t>
-      </w:r>
-      <w:r>
-        <w:rPr>
-          <w:b/>
-          <w:bCs/>
-        </w:rPr>
-        <w:t xml:space="preserve">: </w:t>
-      </w:r>
-      <w:r>
-        <w:t xml:space="preserve">La nube ofrece acceso inmediato a servicios de última generación: inteligencia artificial, machine </w:t>
-      </w:r>
-      <w:proofErr w:type="spellStart"/>
-      <w:r>
-        <w:t>learning</w:t>
-      </w:r>
-      <w:proofErr w:type="spellEnd"/>
-      <w:r>
-        <w:t xml:space="preserve">, </w:t>
-      </w:r>
-      <w:proofErr w:type="spellStart"/>
-      <w:r>
-        <w:t>blockchain</w:t>
-      </w:r>
-      <w:proofErr w:type="spellEnd"/>
-      <w:r>
-        <w:t>, realidad aumentada, entre otros.</w:t>
-      </w:r>
-    </w:p>
-    <w:p>
-      <w:pPr>
-        <w:rPr>
-          <w:b/>
-          <w:bCs/>
-        </w:rPr>
-      </w:pPr>
-      <w:r>
-        <w:rPr>
-          <w:b/>
-          <w:bCs/>
-        </w:rPr>
-        <w:t>7. </w:t>
-      </w:r>
-      <w:r>
-        <w:rPr>
-          <w:rFonts w:ascii="Segoe UI Symbol" w:hAnsi="Segoe UI Symbol" w:cs="Segoe UI Symbol"/>
-          <w:b/>
-          <w:bCs/>
-        </w:rPr>
-        <w:t>⚡</w:t>
+        <w:t xml:space="preserve">7. Despliegue </w:t>
       </w:r>
       <w:r>
         <w:rPr>
@@ -4051,14 +3872,14 @@
           <w:b/>
           <w:bCs/>
         </w:rPr>
-        <w:t> </w:t>
+        <w:t>á</w:t>
       </w:r>
       <w:r>
         <w:rPr>
           <w:b/>
           <w:bCs/>
         </w:rPr>
-        <w:t xml:space="preserve">Despliegue </w:t>
+        <w:t>gil y automatizaci</w:t>
       </w:r>
       <w:r>
         <w:rPr>
@@ -4066,70 +3887,62 @@
           <w:b/>
           <w:bCs/>
         </w:rPr>
-        <w:t>á</w:t>
+        <w:t>ó</w:t>
       </w:r>
       <w:r>
         <w:rPr>
           <w:b/>
           <w:bCs/>
         </w:rPr>
-        <w:t>gil y automatizaci</w:t>
-      </w:r>
-      <w:r>
-        <w:rPr>
-          <w:rFonts w:ascii="Calibri Light" w:hAnsi="Calibri Light" w:cs="Calibri Light"/>
+        <w:t>n</w:t>
+      </w:r>
+      <w:r>
+        <w:rPr>
           <w:b/>
           <w:bCs/>
         </w:rPr>
-        <w:t>ó</w:t>
-      </w:r>
-      <w:r>
+        <w:t xml:space="preserve">: </w:t>
+      </w:r>
+      <w:r>
+        <w:t xml:space="preserve">Es posible crear entornos completos en minutos usando herramientas de </w:t>
+      </w:r>
+      <w:r>
+        <w:rPr>
+          <w:rStyle w:val="Textoennegrita"/>
+        </w:rPr>
+        <w:t>infraestructura como código (</w:t>
+      </w:r>
+      <w:proofErr w:type="spellStart"/>
+      <w:r>
+        <w:rPr>
+          <w:rStyle w:val="Textoennegrita"/>
+        </w:rPr>
+        <w:t>IaC</w:t>
+      </w:r>
+      <w:proofErr w:type="spellEnd"/>
+      <w:r>
+        <w:rPr>
+          <w:rStyle w:val="Textoennegrita"/>
+        </w:rPr>
+        <w:t>)</w:t>
+      </w:r>
+      <w:r>
+        <w:t>. Esto acelera el desarrollo y reduce errores.</w:t>
+      </w:r>
+    </w:p>
+    <w:p>
+      <w:pPr>
+        <w:ind w:left="0"/>
         <w:rPr>
           <w:b/>
           <w:bCs/>
         </w:rPr>
-        <w:t>n</w:t>
-      </w:r>
+      </w:pPr>
       <w:r>
         <w:rPr>
           <w:b/>
           <w:bCs/>
         </w:rPr>
-        <w:t xml:space="preserve">: </w:t>
-      </w:r>
-      <w:r>
-        <w:t xml:space="preserve">Es posible crear entornos completos en minutos usando herramientas de </w:t>
-      </w:r>
-      <w:r>
-        <w:rPr>
-          <w:rStyle w:val="Textoennegrita"/>
-        </w:rPr>
-        <w:t>infraestructura como código (</w:t>
-      </w:r>
-      <w:proofErr w:type="spellStart"/>
-      <w:r>
-        <w:rPr>
-          <w:rStyle w:val="Textoennegrita"/>
-        </w:rPr>
-        <w:t>IaC</w:t>
-      </w:r>
-      <w:proofErr w:type="spellEnd"/>
-      <w:r>
-        <w:rPr>
-          <w:rStyle w:val="Textoennegrita"/>
-        </w:rPr>
-        <w:t>)</w:t>
-      </w:r>
-      <w:r>
-        <w:t>. Esto acelera el desarrollo y reduce errores.</w:t>
-      </w:r>
-    </w:p>
-    <w:p>
-      <w:pPr>
-        <w:pStyle w:val="Ttulo3"/>
-        <w:ind w:left="0"/>
-      </w:pPr>
-      <w:r>
         <w:t>Debes conocer</w:t>
       </w:r>
     </w:p>
@@ -4240,6 +4053,7 @@
     <w:p>
       <w:pPr>
         <w:spacing w:before="100" w:beforeAutospacing="1" w:after="100" w:afterAutospacing="1" w:line="240" w:lineRule="auto"/>
+        <w:ind w:left="0"/>
       </w:pPr>
       <w:r>
         <w:rPr>
@@ -4432,87 +4246,72 @@
     </w:p>
     <w:p>
       <w:pPr>
+        <w:ind w:left="0"/>
+        <w:rPr>
+          <w:bCs/>
+        </w:rPr>
+      </w:pPr>
+      <w:r>
+        <w:rPr>
+          <w:rStyle w:val="Textoennegrita"/>
+          <w:bCs w:val="0"/>
+        </w:rPr>
+        <w:t>¿Cómo se lleva a cabo una migración segura y eficiente a la nube?</w:t>
+      </w:r>
+    </w:p>
+    <w:p>
+      <w:pPr>
+        <w:pStyle w:val="NormalWeb"/>
+        <w:ind w:left="0"/>
+      </w:pPr>
+      <w:r>
+        <w:t xml:space="preserve">Migrar a la nube no consiste simplemente en trasladar archivos o aplicaciones de un entorno local a uno remoto. Es un </w:t>
+      </w:r>
+      <w:r>
+        <w:rPr>
+          <w:rStyle w:val="Textoennegrita"/>
+          <w:rFonts w:eastAsiaTheme="majorEastAsia"/>
+        </w:rPr>
+        <w:t>proceso estructurado</w:t>
+      </w:r>
+      <w:r>
+        <w:t xml:space="preserve"> que implica evaluación técnica, selección de estrategias adecuadas, planificación de arquitectura, uso de herramientas especializadas y cumplimiento de requisitos de seguridad y normativas.</w:t>
+      </w:r>
+    </w:p>
+    <w:p>
+      <w:pPr>
+        <w:pStyle w:val="NormalWeb"/>
+        <w:ind w:left="0"/>
+      </w:pPr>
+      <w:r>
+        <w:t xml:space="preserve">Una migración bien diseñada permite </w:t>
+      </w:r>
+      <w:r>
+        <w:rPr>
+          <w:rStyle w:val="Textoennegrita"/>
+          <w:rFonts w:eastAsiaTheme="majorEastAsia"/>
+        </w:rPr>
+        <w:t>optimizar recursos, reducir costes y adoptar nuevas tecnologías</w:t>
+      </w:r>
+      <w:r>
+        <w:t xml:space="preserve"> sin comprometer la operatividad ni la integridad de los datos.</w:t>
+      </w:r>
+    </w:p>
+    <w:p>
+      <w:pPr>
         <w:pStyle w:val="Ttulo3"/>
         <w:ind w:left="0"/>
       </w:pPr>
       <w:r>
-        <w:rPr>
-          <w:rStyle w:val="Textoennegrita"/>
-          <w:b/>
-          <w:bCs w:val="0"/>
-        </w:rPr>
-        <w:t>¿Cómo se lleva a cabo una migración segura y eficiente a la nube?</w:t>
-      </w:r>
-    </w:p>
-    <w:p>
-      <w:pPr>
-        <w:pStyle w:val="NormalWeb"/>
-        <w:ind w:left="0"/>
-      </w:pPr>
-      <w:r>
-        <w:t xml:space="preserve">Migrar a la nube no consiste simplemente en trasladar archivos o aplicaciones de un entorno local a uno remoto. Es un </w:t>
-      </w:r>
-      <w:r>
-        <w:rPr>
-          <w:rStyle w:val="Textoennegrita"/>
-          <w:rFonts w:eastAsiaTheme="majorEastAsia"/>
-        </w:rPr>
-        <w:t>proceso estructurado</w:t>
-      </w:r>
-      <w:r>
-        <w:t xml:space="preserve"> que implica evaluación técnica, selección de estrategias adecuadas, </w:t>
-      </w:r>
-      <w:r>
         <w:lastRenderedPageBreak/>
-        <w:t>planificación de arquitectura, uso de herramientas especializadas y cumplimiento de requisitos de seguridad y normativas.</w:t>
-      </w:r>
-    </w:p>
-    <w:p>
-      <w:pPr>
-        <w:pStyle w:val="NormalWeb"/>
-        <w:ind w:left="0"/>
-      </w:pPr>
-      <w:r>
-        <w:t xml:space="preserve">Una migración bien diseñada permite </w:t>
-      </w:r>
-      <w:r>
-        <w:rPr>
-          <w:rStyle w:val="Textoennegrita"/>
-          <w:rFonts w:eastAsiaTheme="majorEastAsia"/>
-        </w:rPr>
-        <w:t>optimizar recursos, reducir costes y adoptar nuevas tecnologías</w:t>
-      </w:r>
-      <w:r>
-        <w:t xml:space="preserve"> sin comprometer la operatividad ni la integridad de los datos.</w:t>
-      </w:r>
-    </w:p>
-    <w:p>
-      <w:pPr>
-        <w:pStyle w:val="Ttulo3"/>
-      </w:pPr>
-      <w:r>
-        <w:t>1. </w:t>
-      </w:r>
-      <w:r>
-        <w:rPr>
-          <w:rFonts w:ascii="Segoe UI Symbol" w:hAnsi="Segoe UI Symbol" w:cs="Segoe UI Symbol"/>
-        </w:rPr>
-        <w:t>✅</w:t>
-      </w:r>
-      <w:r>
-        <w:rPr>
-          <w:rFonts w:ascii="Calibri Light" w:hAnsi="Calibri Light" w:cs="Calibri Light"/>
-        </w:rPr>
-        <w:t> </w:t>
-      </w:r>
-      <w:r>
-        <w:t>Razones para migrar a la nube </w:t>
+        <w:t>1. Razones para migrar a la nube </w:t>
       </w:r>
     </w:p>
     <w:p>
       <w:pPr>
         <w:pStyle w:val="NormalWeb"/>
         <w:spacing w:before="0" w:beforeAutospacing="0"/>
+        <w:ind w:left="0"/>
       </w:pPr>
       <w:r>
         <w:t>Las motivaciones para migrar pueden variar según el tipo de organización, pero suelen estar asociadas a necesidades de eficiencia, escalabilidad y transformación digital. Entre las razones más frecuentes se encuentran:</w:t>
@@ -4524,7 +4323,12 @@
           <w:ilvl w:val="0"/>
           <w:numId w:val="15"/>
         </w:numPr>
+        <w:tabs>
+          <w:tab w:val="clear" w:pos="720"/>
+          <w:tab w:val="num" w:pos="436"/>
+        </w:tabs>
         <w:spacing w:before="100" w:beforeAutospacing="1" w:after="100" w:afterAutospacing="1" w:line="240" w:lineRule="auto"/>
+        <w:ind w:left="436"/>
       </w:pPr>
       <w:r>
         <w:rPr>
@@ -4542,7 +4346,12 @@
           <w:ilvl w:val="0"/>
           <w:numId w:val="15"/>
         </w:numPr>
+        <w:tabs>
+          <w:tab w:val="clear" w:pos="720"/>
+          <w:tab w:val="num" w:pos="436"/>
+        </w:tabs>
         <w:spacing w:before="100" w:beforeAutospacing="1" w:after="100" w:afterAutospacing="1" w:line="240" w:lineRule="auto"/>
+        <w:ind w:left="436"/>
       </w:pPr>
       <w:r>
         <w:t xml:space="preserve">Necesidad de </w:t>
@@ -4563,7 +4372,12 @@
           <w:ilvl w:val="0"/>
           <w:numId w:val="15"/>
         </w:numPr>
+        <w:tabs>
+          <w:tab w:val="clear" w:pos="720"/>
+          <w:tab w:val="num" w:pos="436"/>
+        </w:tabs>
         <w:spacing w:before="100" w:beforeAutospacing="1" w:after="100" w:afterAutospacing="1" w:line="240" w:lineRule="auto"/>
+        <w:ind w:left="436"/>
       </w:pPr>
       <w:r>
         <w:t xml:space="preserve">Requisitos de </w:t>
@@ -4584,7 +4398,12 @@
           <w:ilvl w:val="0"/>
           <w:numId w:val="15"/>
         </w:numPr>
+        <w:tabs>
+          <w:tab w:val="clear" w:pos="720"/>
+          <w:tab w:val="num" w:pos="436"/>
+        </w:tabs>
         <w:spacing w:before="100" w:beforeAutospacing="1" w:after="100" w:afterAutospacing="1" w:line="240" w:lineRule="auto"/>
+        <w:ind w:left="436"/>
       </w:pPr>
       <w:r>
         <w:t xml:space="preserve">Adopción de </w:t>
@@ -4605,7 +4424,12 @@
           <w:ilvl w:val="0"/>
           <w:numId w:val="15"/>
         </w:numPr>
+        <w:tabs>
+          <w:tab w:val="clear" w:pos="720"/>
+          <w:tab w:val="num" w:pos="436"/>
+        </w:tabs>
         <w:spacing w:before="100" w:beforeAutospacing="1" w:after="100" w:afterAutospacing="1" w:line="240" w:lineRule="auto"/>
+        <w:ind w:left="436"/>
       </w:pPr>
       <w:r>
         <w:t>Cumplimiento de normativas o necesidad de modernización.</w:t>
@@ -4614,24 +4438,17 @@
     <w:p>
       <w:pPr>
         <w:pStyle w:val="Ttulo3"/>
-      </w:pPr>
-      <w:r>
-        <w:t>2. </w:t>
-      </w:r>
-      <w:r>
-        <w:rPr>
-          <w:rFonts w:ascii="Segoe UI Symbol" w:hAnsi="Segoe UI Symbol" w:cs="Segoe UI Symbol"/>
-        </w:rPr>
-        <w:t>🔍</w:t>
-      </w:r>
-      <w:r>
-        <w:t> Evaluación inicial </w:t>
+        <w:ind w:left="0"/>
+      </w:pPr>
+      <w:r>
+        <w:t>2. Evaluación inicial </w:t>
       </w:r>
     </w:p>
     <w:p>
       <w:pPr>
         <w:pStyle w:val="NormalWeb"/>
         <w:spacing w:before="0" w:beforeAutospacing="0"/>
+        <w:ind w:left="0"/>
       </w:pPr>
       <w:r>
         <w:t xml:space="preserve">Antes de migrar, es fundamental </w:t>
@@ -4653,7 +4470,12 @@
           <w:ilvl w:val="0"/>
           <w:numId w:val="16"/>
         </w:numPr>
+        <w:tabs>
+          <w:tab w:val="clear" w:pos="720"/>
+          <w:tab w:val="num" w:pos="436"/>
+        </w:tabs>
         <w:spacing w:before="100" w:beforeAutospacing="1" w:after="100" w:afterAutospacing="1" w:line="240" w:lineRule="auto"/>
+        <w:ind w:left="436"/>
       </w:pPr>
       <w:r>
         <w:rPr>
@@ -4671,7 +4493,12 @@
           <w:ilvl w:val="0"/>
           <w:numId w:val="16"/>
         </w:numPr>
+        <w:tabs>
+          <w:tab w:val="clear" w:pos="720"/>
+          <w:tab w:val="num" w:pos="436"/>
+        </w:tabs>
         <w:spacing w:before="100" w:beforeAutospacing="1" w:after="100" w:afterAutospacing="1" w:line="240" w:lineRule="auto"/>
+        <w:ind w:left="436"/>
       </w:pPr>
       <w:r>
         <w:rPr>
@@ -4689,7 +4516,12 @@
           <w:ilvl w:val="0"/>
           <w:numId w:val="16"/>
         </w:numPr>
+        <w:tabs>
+          <w:tab w:val="clear" w:pos="720"/>
+          <w:tab w:val="num" w:pos="436"/>
+        </w:tabs>
         <w:spacing w:before="100" w:beforeAutospacing="1" w:after="100" w:afterAutospacing="1" w:line="240" w:lineRule="auto"/>
+        <w:ind w:left="436"/>
       </w:pPr>
       <w:r>
         <w:rPr>
@@ -4749,7 +4581,12 @@
           <w:ilvl w:val="0"/>
           <w:numId w:val="16"/>
         </w:numPr>
+        <w:tabs>
+          <w:tab w:val="clear" w:pos="720"/>
+          <w:tab w:val="num" w:pos="436"/>
+        </w:tabs>
         <w:spacing w:before="100" w:beforeAutospacing="1" w:after="100" w:afterAutospacing="1" w:line="240" w:lineRule="auto"/>
+        <w:ind w:left="436"/>
       </w:pPr>
       <w:r>
         <w:rPr>
@@ -4764,6 +4601,7 @@
     <w:p>
       <w:pPr>
         <w:pStyle w:val="Ttulo3"/>
+        <w:ind w:left="0"/>
       </w:pPr>
       <w:r>
         <w:t xml:space="preserve">3. Estrategias de migración (las 6 R) </w:t>
@@ -4779,6 +4617,7 @@
       <w:pPr>
         <w:pStyle w:val="NormalWeb"/>
         <w:spacing w:before="0" w:beforeAutospacing="0"/>
+        <w:ind w:left="0"/>
       </w:pPr>
       <w:r>
         <w:t>Seis estrategias permiten abordar la migración según el tipo de aplicación y sus necesidades:</w:t>
@@ -5196,22 +5035,7 @@
         <w:ind w:left="0"/>
       </w:pPr>
       <w:r>
-        <w:t>4. </w:t>
-      </w:r>
-      <w:r>
-        <w:rPr>
-          <w:rFonts w:ascii="Segoe UI Symbol" w:hAnsi="Segoe UI Symbol" w:cs="Segoe UI Symbol"/>
-        </w:rPr>
-        <w:t>🏗</w:t>
-      </w:r>
-      <w:r>
-        <w:rPr>
-          <w:rFonts w:ascii="Calibri Light" w:hAnsi="Calibri Light" w:cs="Calibri Light"/>
-        </w:rPr>
-        <w:t xml:space="preserve"> </w:t>
-      </w:r>
-      <w:r>
-        <w:t>Planificación y diseño del entorno</w:t>
+        <w:t>4. Planificación y diseño del entorno</w:t>
       </w:r>
     </w:p>
     <w:p>
@@ -5253,7 +5077,6 @@
         <w:rPr>
           <w:rStyle w:val="Textoennegrita"/>
         </w:rPr>
-        <w:lastRenderedPageBreak/>
         <w:t>Diseño de redes virtuales (VPC)</w:t>
       </w:r>
       <w:r>
@@ -5327,16 +5150,8 @@
         <w:pStyle w:val="Ttulo3"/>
       </w:pPr>
       <w:r>
-        <w:t>5. </w:t>
-      </w:r>
-      <w:r>
-        <w:rPr>
-          <w:rFonts w:ascii="Apple Color Emoji" w:hAnsi="Apple Color Emoji" w:cs="Apple Color Emoji"/>
-        </w:rPr>
-        <w:t>🧰</w:t>
-      </w:r>
-      <w:r>
-        <w:t> Herramientas y servicios de migración </w:t>
+        <w:lastRenderedPageBreak/>
+        <w:t>5. Herramientas y servicios de migración </w:t>
       </w:r>
     </w:p>
     <w:p>
@@ -5359,34 +5174,18 @@
     </w:p>
     <w:p>
       <w:pPr>
-        <w:pStyle w:val="Ttulo3"/>
-        <w:rPr>
-          <w:b w:val="0"/>
+        <w:rPr>
           <w:bCs/>
-          <w:sz w:val="22"/>
-          <w:szCs w:val="22"/>
-        </w:rPr>
-      </w:pPr>
-      <w:r>
-        <w:rPr>
-          <w:rStyle w:val="Textoennegrita"/>
-          <w:rFonts w:ascii="Apple Color Emoji" w:hAnsi="Apple Color Emoji" w:cs="Apple Color Emoji"/>
-          <w:b/>
+        </w:rPr>
+      </w:pPr>
+      <w:r>
+        <w:rPr>
+          <w:rStyle w:val="Textoennegrita"/>
           <w:bCs w:val="0"/>
           <w:sz w:val="22"/>
           <w:szCs w:val="22"/>
         </w:rPr>
-        <w:t>🟦</w:t>
-      </w:r>
-      <w:r>
-        <w:rPr>
-          <w:rStyle w:val="Textoennegrita"/>
-          <w:b/>
-          <w:bCs w:val="0"/>
-          <w:sz w:val="22"/>
-          <w:szCs w:val="22"/>
-        </w:rPr>
-        <w:t xml:space="preserve"> AWS:</w:t>
+        <w:t>AWS:</w:t>
       </w:r>
     </w:p>
     <w:p>
@@ -5500,34 +5299,18 @@
     </w:p>
     <w:p>
       <w:pPr>
-        <w:pStyle w:val="Ttulo3"/>
-        <w:rPr>
-          <w:b w:val="0"/>
+        <w:rPr>
           <w:bCs/>
-          <w:sz w:val="22"/>
-          <w:szCs w:val="22"/>
-        </w:rPr>
-      </w:pPr>
-      <w:r>
-        <w:rPr>
-          <w:rStyle w:val="Textoennegrita"/>
-          <w:rFonts w:ascii="Apple Color Emoji" w:hAnsi="Apple Color Emoji" w:cs="Apple Color Emoji"/>
-          <w:b/>
+        </w:rPr>
+      </w:pPr>
+      <w:r>
+        <w:rPr>
+          <w:rStyle w:val="Textoennegrita"/>
           <w:bCs w:val="0"/>
           <w:sz w:val="22"/>
           <w:szCs w:val="22"/>
         </w:rPr>
-        <w:t>🟩</w:t>
-      </w:r>
-      <w:r>
-        <w:rPr>
-          <w:rStyle w:val="Textoennegrita"/>
-          <w:b/>
-          <w:bCs w:val="0"/>
-          <w:sz w:val="22"/>
-          <w:szCs w:val="22"/>
-        </w:rPr>
-        <w:t xml:space="preserve"> Azure:</w:t>
+        <w:t>Azure:</w:t>
       </w:r>
     </w:p>
     <w:p>
@@ -5586,34 +5369,18 @@
     </w:p>
     <w:p>
       <w:pPr>
-        <w:pStyle w:val="Ttulo3"/>
-        <w:rPr>
-          <w:b w:val="0"/>
+        <w:rPr>
           <w:bCs/>
-          <w:sz w:val="22"/>
-          <w:szCs w:val="22"/>
-        </w:rPr>
-      </w:pPr>
-      <w:r>
-        <w:rPr>
-          <w:rStyle w:val="Textoennegrita"/>
-          <w:rFonts w:ascii="Apple Color Emoji" w:hAnsi="Apple Color Emoji" w:cs="Apple Color Emoji"/>
-          <w:b/>
+        </w:rPr>
+      </w:pPr>
+      <w:r>
+        <w:rPr>
+          <w:rStyle w:val="Textoennegrita"/>
           <w:bCs w:val="0"/>
           <w:sz w:val="22"/>
           <w:szCs w:val="22"/>
         </w:rPr>
-        <w:t>🟥</w:t>
-      </w:r>
-      <w:r>
-        <w:rPr>
-          <w:rStyle w:val="Textoennegrita"/>
-          <w:b/>
-          <w:bCs w:val="0"/>
-          <w:sz w:val="22"/>
-          <w:szCs w:val="22"/>
-        </w:rPr>
-        <w:t xml:space="preserve"> Google Cloud:</w:t>
+        <w:t>Google Cloud:</w:t>
       </w:r>
     </w:p>
     <w:p>
@@ -5705,16 +5472,7 @@
         <w:pStyle w:val="Ttulo3"/>
       </w:pPr>
       <w:r>
-        <w:t xml:space="preserve">6. </w:t>
-      </w:r>
-      <w:r>
-        <w:rPr>
-          <w:rFonts w:ascii="Segoe UI Symbol" w:hAnsi="Segoe UI Symbol" w:cs="Segoe UI Symbol"/>
-        </w:rPr>
-        <w:t>⚙</w:t>
-      </w:r>
-      <w:r>
-        <w:t xml:space="preserve"> Ejecución técnica</w:t>
+        <w:t>6. Ejecución técnica</w:t>
       </w:r>
     </w:p>
     <w:p>
@@ -5810,16 +5568,7 @@
         <w:pStyle w:val="Ttulo3"/>
       </w:pPr>
       <w:r>
-        <w:t xml:space="preserve">7. </w:t>
-      </w:r>
-      <w:r>
-        <w:rPr>
-          <w:rFonts w:ascii="Segoe UI Symbol" w:hAnsi="Segoe UI Symbol" w:cs="Segoe UI Symbol"/>
-        </w:rPr>
-        <w:t>📈</w:t>
-      </w:r>
-      <w:r>
-        <w:t xml:space="preserve"> Optimización y operación continua</w:t>
+        <w:t>7. Optimización y operación continua</w:t>
       </w:r>
     </w:p>
     <w:p>
@@ -5949,17 +5698,7 @@
         <w:pStyle w:val="Ttulo3"/>
       </w:pPr>
       <w:r>
-        <w:lastRenderedPageBreak/>
-        <w:t xml:space="preserve">8. </w:t>
-      </w:r>
-      <w:r>
-        <w:rPr>
-          <w:rFonts w:ascii="Segoe UI Symbol" w:hAnsi="Segoe UI Symbol" w:cs="Segoe UI Symbol"/>
-        </w:rPr>
-        <w:t>🔐</w:t>
-      </w:r>
-      <w:r>
-        <w:t xml:space="preserve"> Consideraciones de seguridad y cumplimiento</w:t>
+        <w:t>8. Consideraciones de seguridad y cumplimiento</w:t>
       </w:r>
     </w:p>
     <w:p>
@@ -5989,6 +5728,7 @@
         <w:spacing w:before="100" w:beforeAutospacing="1" w:after="100" w:afterAutospacing="1" w:line="240" w:lineRule="auto"/>
       </w:pPr>
       <w:r>
+        <w:lastRenderedPageBreak/>
         <w:t xml:space="preserve">Aplicación del </w:t>
       </w:r>
       <w:r>
@@ -6066,10 +5806,17 @@
     </w:p>
     <w:p>
       <w:pPr>
-        <w:pStyle w:val="Ttulo3"/>
         <w:ind w:left="0"/>
-      </w:pPr>
-      <w:r>
+        <w:rPr>
+          <w:b/>
+          <w:bCs/>
+        </w:rPr>
+      </w:pPr>
+      <w:r>
+        <w:rPr>
+          <w:b/>
+          <w:bCs/>
+        </w:rPr>
         <w:t>Debes conocer</w:t>
       </w:r>
     </w:p>
@@ -6400,13 +6147,11 @@
     </w:p>
     <w:p>
       <w:pPr>
-        <w:pStyle w:val="Ttulo2"/>
         <w:ind w:left="0"/>
       </w:pPr>
       <w:r>
         <w:rPr>
           <w:rStyle w:val="Textoennegrita"/>
-          <w:b/>
         </w:rPr>
         <w:t>¿Qué incluye realmente la infraestructura de la nube?</w:t>
       </w:r>
@@ -6437,11 +6182,7 @@
         <w:t>conjunto de recursos tecnológicos virtualizados</w:t>
       </w:r>
       <w:r>
-        <w:t xml:space="preserve"> que permiten ejecutar aplicaciones, almacenar información y gestionar servicios digitales a través de Internet. Aunque </w:t>
-      </w:r>
-      <w:r>
-        <w:lastRenderedPageBreak/>
-        <w:t xml:space="preserve">para el usuario final la nube puede parecer "invisible", detrás de ella hay una arquitectura compleja, escalable y altamente automatizada, gestionada por grandes proveedores como </w:t>
+        <w:t xml:space="preserve"> que permiten ejecutar aplicaciones, almacenar información y gestionar servicios digitales a través de Internet. Aunque para el usuario final la nube puede parecer "invisible", detrás de ella hay una arquitectura compleja, escalable y altamente automatizada, gestionada por grandes proveedores como </w:t>
       </w:r>
       <w:r>
         <w:rPr>
@@ -6460,6 +6201,7 @@
         <w:ind w:left="0"/>
       </w:pPr>
       <w:r>
+        <w:lastRenderedPageBreak/>
         <w:t xml:space="preserve">A diferencia de los sistemas tradicionales —donde las empresas compraban y mantenían servidores físicos—, la nube permite acceder a estos recursos </w:t>
       </w:r>
       <w:r>
@@ -6485,6 +6227,7 @@
     <w:p>
       <w:pPr>
         <w:pStyle w:val="NormalWeb"/>
+        <w:ind w:left="0"/>
       </w:pPr>
       <w:r>
         <w:rPr>
@@ -6530,6 +6273,7 @@
     <w:p>
       <w:pPr>
         <w:pStyle w:val="NormalWeb"/>
+        <w:ind w:left="0"/>
       </w:pPr>
       <w:r>
         <w:rPr>
@@ -6571,8 +6315,6 @@
           </wp:inline>
         </w:drawing>
       </w:r>
-    </w:p>
-    <w:p>
       <w:r>
         <w:rPr>
           <w:noProof/>
@@ -6613,8 +6355,6 @@
           </wp:inline>
         </w:drawing>
       </w:r>
-    </w:p>
-    <w:p>
       <w:r>
         <w:rPr>
           <w:noProof/>
@@ -6724,27 +6464,20 @@
           <w:i/>
           <w:iCs/>
         </w:rPr>
-        <w:t xml:space="preserve"> (recursos abstraídos, programables y escalables que </w:t>
-      </w:r>
-      <w:r>
-        <w:rPr>
-          <w:i/>
-          <w:iCs/>
+        <w:t xml:space="preserve"> (recursos abstraídos, programables y escalables que utiliza el usuario). Ambos trabajan en conjunto para ofrecer los servicios de la nube con alta disponibilidad, redundancia y rendimiento.”</w:t>
+      </w:r>
+    </w:p>
+    <w:p>
+      <w:pPr>
+        <w:pStyle w:val="Ttulo3"/>
+      </w:pPr>
+      <w:r>
+        <w:rPr>
+          <w:rStyle w:val="Textoennegrita"/>
+          <w:b/>
+          <w:bCs w:val="0"/>
         </w:rPr>
         <w:lastRenderedPageBreak/>
-        <w:t>utiliza el usuario). Ambos trabajan en conjunto para ofrecer los servicios de la nube con alta disponibilidad, redundancia y rendimiento.”</w:t>
-      </w:r>
-    </w:p>
-    <w:p>
-      <w:pPr>
-        <w:pStyle w:val="Ttulo3"/>
-        <w:ind w:left="0"/>
-      </w:pPr>
-      <w:r>
-        <w:rPr>
-          <w:rStyle w:val="Textoennegrita"/>
-          <w:b/>
-        </w:rPr>
         <w:t>A. Componentes físicos</w:t>
       </w:r>
     </w:p>
@@ -6798,38 +6531,30 @@
     </w:p>
     <w:p>
       <w:pPr>
-        <w:pStyle w:val="Ttulo3"/>
-        <w:ind w:left="0"/>
-        <w:rPr>
-          <w:rStyle w:val="Textoennegrita"/>
-          <w:b/>
+        <w:rPr>
+          <w:rStyle w:val="Textoennegrita"/>
+          <w:b w:val="0"/>
           <w:bCs w:val="0"/>
         </w:rPr>
       </w:pPr>
       <w:r>
         <w:rPr>
           <w:rStyle w:val="Textoennegrita"/>
-          <w:b/>
         </w:rPr>
         <w:t>Principales componentes físicos:</w:t>
       </w:r>
     </w:p>
     <w:p>
-      <w:pPr>
-        <w:pStyle w:val="Ttulo3"/>
-      </w:pPr>
       <w:r>
         <w:rPr>
           <w:rStyle w:val="Textoennegrita"/>
           <w:rFonts w:ascii="Apple Color Emoji" w:hAnsi="Apple Color Emoji" w:cs="Apple Color Emoji"/>
-          <w:b/>
         </w:rPr>
         <w:t>🖥</w:t>
       </w:r>
       <w:r>
         <w:rPr>
           <w:rStyle w:val="Textoennegrita"/>
-          <w:b/>
         </w:rPr>
         <w:t xml:space="preserve"> Servidores físicos (</w:t>
       </w:r>
@@ -6837,7 +6562,6 @@
       <w:r>
         <w:rPr>
           <w:rStyle w:val="Textoennegrita"/>
-          <w:b/>
         </w:rPr>
         <w:t>bare</w:t>
       </w:r>
@@ -6845,7 +6569,6 @@
       <w:r>
         <w:rPr>
           <w:rStyle w:val="Textoennegrita"/>
-          <w:b/>
         </w:rPr>
         <w:t>-metal)</w:t>
       </w:r>
@@ -6945,21 +6668,16 @@
       </w:r>
     </w:p>
     <w:p>
-      <w:pPr>
-        <w:pStyle w:val="Ttulo3"/>
-      </w:pPr>
       <w:r>
         <w:rPr>
           <w:rStyle w:val="Textoennegrita"/>
           <w:rFonts w:ascii="Apple Color Emoji" w:hAnsi="Apple Color Emoji" w:cs="Apple Color Emoji"/>
-          <w:b/>
         </w:rPr>
         <w:t>📼</w:t>
       </w:r>
       <w:r>
         <w:rPr>
           <w:rStyle w:val="Textoennegrita"/>
-          <w:b/>
         </w:rPr>
         <w:t xml:space="preserve"> Sistemas de almacenamiento</w:t>
       </w:r>
@@ -7086,21 +6804,16 @@
       </w:r>
     </w:p>
     <w:p>
-      <w:pPr>
-        <w:pStyle w:val="Ttulo3"/>
-      </w:pPr>
       <w:r>
         <w:rPr>
           <w:rStyle w:val="Textoennegrita"/>
           <w:rFonts w:ascii="Apple Color Emoji" w:hAnsi="Apple Color Emoji" w:cs="Apple Color Emoji"/>
-          <w:b/>
         </w:rPr>
         <w:t>🧲</w:t>
       </w:r>
       <w:r>
         <w:rPr>
           <w:rStyle w:val="Textoennegrita"/>
-          <w:b/>
         </w:rPr>
         <w:t xml:space="preserve"> Red física</w:t>
       </w:r>
@@ -7188,21 +6901,16 @@
       </w:r>
     </w:p>
     <w:p>
-      <w:pPr>
-        <w:pStyle w:val="Ttulo3"/>
-      </w:pPr>
       <w:r>
         <w:rPr>
           <w:rStyle w:val="Textoennegrita"/>
           <w:rFonts w:ascii="Apple Color Emoji" w:hAnsi="Apple Color Emoji" w:cs="Apple Color Emoji"/>
-          <w:b/>
         </w:rPr>
         <w:t>💿</w:t>
       </w:r>
       <w:r>
         <w:rPr>
           <w:rStyle w:val="Textoennegrita"/>
-          <w:b/>
         </w:rPr>
         <w:t xml:space="preserve"> Sistemas de energía y refrigeración</w:t>
       </w:r>
@@ -7268,21 +6976,16 @@
       </w:r>
     </w:p>
     <w:p>
-      <w:pPr>
-        <w:pStyle w:val="Ttulo3"/>
-      </w:pPr>
       <w:r>
         <w:rPr>
           <w:rStyle w:val="Textoennegrita"/>
           <w:rFonts w:ascii="Apple Color Emoji" w:hAnsi="Apple Color Emoji" w:cs="Apple Color Emoji"/>
-          <w:b/>
         </w:rPr>
         <w:t>🔐</w:t>
       </w:r>
       <w:r>
         <w:rPr>
           <w:rStyle w:val="Textoennegrita"/>
-          <w:b/>
         </w:rPr>
         <w:t xml:space="preserve"> Seguridad física</w:t>
       </w:r>
@@ -7317,7 +7020,6 @@
         <w:spacing w:before="100" w:beforeAutospacing="1" w:after="100" w:afterAutospacing="1" w:line="240" w:lineRule="auto"/>
       </w:pPr>
       <w:r>
-        <w:lastRenderedPageBreak/>
         <w:t xml:space="preserve">Los centros de datos suelen contar con </w:t>
       </w:r>
       <w:r>
@@ -7344,124 +7046,120 @@
         <w:pStyle w:val="Ttulo3"/>
       </w:pPr>
       <w:r>
-        <w:rPr>
-          <w:rStyle w:val="Textoennegrita"/>
-          <w:b/>
-        </w:rPr>
-        <w:t xml:space="preserve">B. Componentes virtuales de la infraestructura </w:t>
-      </w:r>
-      <w:proofErr w:type="spellStart"/>
-      <w:r>
-        <w:rPr>
-          <w:rStyle w:val="Textoennegrita"/>
-          <w:b/>
-        </w:rPr>
-        <w:t>cloud</w:t>
-      </w:r>
-      <w:proofErr w:type="spellEnd"/>
-    </w:p>
-    <w:p>
-      <w:pPr>
-        <w:pStyle w:val="NormalWeb"/>
-      </w:pPr>
-      <w:r>
-        <w:t xml:space="preserve">Los </w:t>
-      </w:r>
-      <w:r>
-        <w:rPr>
-          <w:rStyle w:val="Textoennegrita"/>
-          <w:rFonts w:eastAsiaTheme="majorEastAsia"/>
-        </w:rPr>
-        <w:t>componentes virtuales</w:t>
-      </w:r>
-      <w:r>
-        <w:t xml:space="preserve"> representan la capa programable y gestionable por el usuario a través de </w:t>
-      </w:r>
-      <w:r>
-        <w:rPr>
-          <w:rStyle w:val="Textoennegrita"/>
-          <w:rFonts w:eastAsiaTheme="majorEastAsia"/>
-        </w:rPr>
-        <w:t xml:space="preserve">portales web, </w:t>
-      </w:r>
-      <w:proofErr w:type="spellStart"/>
-      <w:r>
-        <w:rPr>
-          <w:rStyle w:val="Textoennegrita"/>
-          <w:rFonts w:eastAsiaTheme="majorEastAsia"/>
-        </w:rPr>
-        <w:t>SDKs</w:t>
-      </w:r>
-      <w:proofErr w:type="spellEnd"/>
-      <w:r>
-        <w:rPr>
-          <w:rStyle w:val="Textoennegrita"/>
-          <w:rFonts w:eastAsiaTheme="majorEastAsia"/>
-        </w:rPr>
-        <w:t xml:space="preserve"> o </w:t>
-      </w:r>
-      <w:proofErr w:type="spellStart"/>
-      <w:r>
-        <w:rPr>
-          <w:rStyle w:val="Textoennegrita"/>
-          <w:rFonts w:eastAsiaTheme="majorEastAsia"/>
-        </w:rPr>
-        <w:t>APIs</w:t>
-      </w:r>
-      <w:proofErr w:type="spellEnd"/>
-      <w:r>
-        <w:t>.</w:t>
-      </w:r>
-      <w:r>
-        <w:t xml:space="preserve"> </w:t>
-      </w:r>
-      <w:r>
-        <w:t xml:space="preserve">Estos recursos abstraen la complejidad del hardware físico, y permiten </w:t>
-      </w:r>
-      <w:r>
-        <w:rPr>
-          <w:rStyle w:val="Textoennegrita"/>
-          <w:rFonts w:eastAsiaTheme="majorEastAsia"/>
-        </w:rPr>
-        <w:t>provisionar, escalar y automatizar servicios en segundos</w:t>
-      </w:r>
-      <w:r>
-        <w:t>, con máxima flexibilidad.</w:t>
-      </w:r>
-    </w:p>
-    <w:p>
-      <w:pPr>
-        <w:pStyle w:val="Ttulo3"/>
         <w:rPr>
           <w:rStyle w:val="Textoennegrita"/>
           <w:b/>
           <w:bCs w:val="0"/>
         </w:rPr>
-      </w:pPr>
+        <w:lastRenderedPageBreak/>
+        <w:t xml:space="preserve">B. Componentes virtuales de la infraestructura </w:t>
+      </w:r>
+      <w:proofErr w:type="spellStart"/>
       <w:r>
         <w:rPr>
           <w:rStyle w:val="Textoennegrita"/>
           <w:b/>
+          <w:bCs w:val="0"/>
+        </w:rPr>
+        <w:t>cloud</w:t>
+      </w:r>
+      <w:proofErr w:type="spellEnd"/>
+    </w:p>
+    <w:p>
+      <w:pPr>
+        <w:pStyle w:val="NormalWeb"/>
+      </w:pPr>
+      <w:r>
+        <w:t xml:space="preserve">Los </w:t>
+      </w:r>
+      <w:r>
+        <w:rPr>
+          <w:rStyle w:val="Textoennegrita"/>
+          <w:rFonts w:eastAsiaTheme="majorEastAsia"/>
+        </w:rPr>
+        <w:t>componentes virtuales</w:t>
+      </w:r>
+      <w:r>
+        <w:t xml:space="preserve"> representan la capa programable y gestionable por el usuario a través de </w:t>
+      </w:r>
+      <w:r>
+        <w:rPr>
+          <w:rStyle w:val="Textoennegrita"/>
+          <w:rFonts w:eastAsiaTheme="majorEastAsia"/>
+        </w:rPr>
+        <w:t xml:space="preserve">portales web, </w:t>
+      </w:r>
+      <w:proofErr w:type="spellStart"/>
+      <w:r>
+        <w:rPr>
+          <w:rStyle w:val="Textoennegrita"/>
+          <w:rFonts w:eastAsiaTheme="majorEastAsia"/>
+        </w:rPr>
+        <w:t>SDKs</w:t>
+      </w:r>
+      <w:proofErr w:type="spellEnd"/>
+      <w:r>
+        <w:rPr>
+          <w:rStyle w:val="Textoennegrita"/>
+          <w:rFonts w:eastAsiaTheme="majorEastAsia"/>
+        </w:rPr>
+        <w:t xml:space="preserve"> o </w:t>
+      </w:r>
+      <w:proofErr w:type="spellStart"/>
+      <w:r>
+        <w:rPr>
+          <w:rStyle w:val="Textoennegrita"/>
+          <w:rFonts w:eastAsiaTheme="majorEastAsia"/>
+        </w:rPr>
+        <w:t>APIs</w:t>
+      </w:r>
+      <w:proofErr w:type="spellEnd"/>
+      <w:r>
+        <w:t>.</w:t>
+      </w:r>
+      <w:r>
+        <w:t xml:space="preserve"> </w:t>
+      </w:r>
+      <w:r>
+        <w:t xml:space="preserve">Estos recursos abstraen la complejidad del hardware físico, y permiten </w:t>
+      </w:r>
+      <w:r>
+        <w:rPr>
+          <w:rStyle w:val="Textoennegrita"/>
+          <w:rFonts w:eastAsiaTheme="majorEastAsia"/>
+        </w:rPr>
+        <w:t>provisionar, escalar y automatizar servicios en segundos</w:t>
+      </w:r>
+      <w:r>
+        <w:t>, con máxima flexibilidad.</w:t>
+      </w:r>
+    </w:p>
+    <w:p>
+      <w:pPr>
+        <w:rPr>
+          <w:rStyle w:val="Textoennegrita"/>
+          <w:b w:val="0"/>
+          <w:bCs w:val="0"/>
+        </w:rPr>
+      </w:pPr>
+      <w:r>
+        <w:rPr>
+          <w:rStyle w:val="Textoennegrita"/>
         </w:rPr>
         <w:t>Principales recursos virtuales:</w:t>
       </w:r>
     </w:p>
     <w:p>
-      <w:pPr>
-        <w:pStyle w:val="Ttulo3"/>
-      </w:pPr>
       <w:r>
         <w:rPr>
           <w:rStyle w:val="Textoennegrita"/>
           <w:rFonts w:ascii="Apple Color Emoji" w:hAnsi="Apple Color Emoji" w:cs="Apple Color Emoji"/>
-          <w:b/>
         </w:rPr>
         <w:t>💼</w:t>
       </w:r>
       <w:r>
         <w:rPr>
           <w:rStyle w:val="Textoennegrita"/>
-          <w:b/>
         </w:rPr>
         <w:t xml:space="preserve"> Máquinas virtuales (</w:t>
       </w:r>
@@ -7469,7 +7167,6 @@
       <w:r>
         <w:rPr>
           <w:rStyle w:val="Textoennegrita"/>
-          <w:b/>
         </w:rPr>
         <w:t>VMs</w:t>
       </w:r>
@@ -7477,7 +7174,6 @@
       <w:r>
         <w:rPr>
           <w:rStyle w:val="Textoennegrita"/>
-          <w:b/>
         </w:rPr>
         <w:t>)</w:t>
       </w:r>
@@ -7577,21 +7273,16 @@
       </w:r>
     </w:p>
     <w:p>
-      <w:pPr>
-        <w:pStyle w:val="Ttulo3"/>
-      </w:pPr>
       <w:r>
         <w:rPr>
           <w:rStyle w:val="Textoennegrita"/>
           <w:rFonts w:ascii="Apple Color Emoji" w:hAnsi="Apple Color Emoji" w:cs="Apple Color Emoji"/>
-          <w:b/>
         </w:rPr>
         <w:t>🛢</w:t>
       </w:r>
       <w:r>
         <w:rPr>
           <w:rStyle w:val="Textoennegrita"/>
-          <w:b/>
         </w:rPr>
         <w:t xml:space="preserve"> Contenedores</w:t>
       </w:r>
@@ -7672,21 +7363,16 @@
       </w:r>
     </w:p>
     <w:p>
-      <w:pPr>
-        <w:pStyle w:val="Ttulo3"/>
-      </w:pPr>
       <w:r>
         <w:rPr>
           <w:rStyle w:val="Textoennegrita"/>
           <w:rFonts w:ascii="Apple Color Emoji" w:hAnsi="Apple Color Emoji" w:cs="Apple Color Emoji"/>
-          <w:b/>
         </w:rPr>
         <w:t>🧭</w:t>
       </w:r>
       <w:r>
         <w:rPr>
           <w:rStyle w:val="Textoennegrita"/>
-          <w:b/>
         </w:rPr>
         <w:t xml:space="preserve"> Redes Virtuales</w:t>
       </w:r>
@@ -7790,21 +7476,16 @@
       </w:r>
     </w:p>
     <w:p>
-      <w:pPr>
-        <w:pStyle w:val="Ttulo3"/>
-      </w:pPr>
       <w:r>
         <w:rPr>
           <w:rStyle w:val="Textoennegrita"/>
           <w:rFonts w:ascii="Apple Color Emoji" w:hAnsi="Apple Color Emoji" w:cs="Apple Color Emoji"/>
-          <w:b/>
         </w:rPr>
         <w:t>💿</w:t>
       </w:r>
       <w:r>
         <w:rPr>
           <w:rStyle w:val="Textoennegrita"/>
-          <w:b/>
         </w:rPr>
         <w:t xml:space="preserve"> Almacenamiento virtual</w:t>
       </w:r>
@@ -7888,21 +7569,16 @@
       </w:r>
     </w:p>
     <w:p>
-      <w:pPr>
-        <w:pStyle w:val="Ttulo3"/>
-      </w:pPr>
       <w:r>
         <w:rPr>
           <w:rStyle w:val="Textoennegrita"/>
           <w:rFonts w:ascii="Apple Color Emoji" w:hAnsi="Apple Color Emoji" w:cs="Apple Color Emoji"/>
-          <w:b/>
         </w:rPr>
         <w:t>🔭</w:t>
       </w:r>
       <w:r>
         <w:rPr>
           <w:rStyle w:val="Textoennegrita"/>
-          <w:b/>
         </w:rPr>
         <w:t xml:space="preserve"> Bases de datos como servicio (</w:t>
       </w:r>
@@ -7910,7 +7586,6 @@
       <w:r>
         <w:rPr>
           <w:rStyle w:val="Textoennegrita"/>
-          <w:b/>
         </w:rPr>
         <w:t>DBaaS</w:t>
       </w:r>
@@ -7918,7 +7593,6 @@
       <w:r>
         <w:rPr>
           <w:rStyle w:val="Textoennegrita"/>
-          <w:b/>
         </w:rPr>
         <w:t>)</w:t>
       </w:r>
@@ -8043,22 +7717,16 @@
       </w:r>
     </w:p>
     <w:p>
-      <w:pPr>
-        <w:pStyle w:val="Ttulo3"/>
-      </w:pPr>
       <w:r>
         <w:rPr>
           <w:rStyle w:val="Textoennegrita"/>
           <w:rFonts w:ascii="Apple Color Emoji" w:hAnsi="Apple Color Emoji" w:cs="Apple Color Emoji"/>
-          <w:b/>
-        </w:rPr>
-        <w:lastRenderedPageBreak/>
+        </w:rPr>
         <w:t>📥</w:t>
       </w:r>
       <w:r>
         <w:rPr>
           <w:rStyle w:val="Textoennegrita"/>
-          <w:b/>
         </w:rPr>
         <w:t xml:space="preserve"> Recursos efímeros y </w:t>
       </w:r>
@@ -8066,7 +7734,6 @@
       <w:r>
         <w:rPr>
           <w:rStyle w:val="Textoennegrita"/>
-          <w:b/>
         </w:rPr>
         <w:t>serverless</w:t>
       </w:r>
@@ -8117,6 +7784,7 @@
         <w:rPr>
           <w:rStyle w:val="Textoennegrita"/>
         </w:rPr>
+        <w:lastRenderedPageBreak/>
         <w:t>Instancias spot</w:t>
       </w:r>
       <w:r>
@@ -8192,7 +7860,7 @@
           <w:noProof/>
         </w:rPr>
         <w:drawing>
-          <wp:inline distT="0" distB="0" distL="0" distR="0" wp14:anchorId="587EF2A3" wp14:editId="0D841C8E">
+          <wp:inline distT="0" distB="0" distL="0" distR="0" wp14:anchorId="587EF2A3" wp14:editId="405A6D29">
             <wp:extent cx="6188710" cy="1303655"/>
             <wp:effectExtent l="0" t="0" r="0" b="4445"/>
             <wp:docPr id="1897545085" name="Imagen 1" descr="Texto&#10;&#10;El contenido generado por IA puede ser incorrecto."/>
@@ -8386,13 +8054,11 @@
     </w:p>
     <w:p>
       <w:pPr>
-        <w:pStyle w:val="Ttulo3"/>
         <w:ind w:left="0"/>
       </w:pPr>
       <w:r>
         <w:rPr>
           <w:rStyle w:val="Textoennegrita"/>
-          <w:b/>
         </w:rPr>
         <w:t>Componentes clave de la infraestructura global</w:t>
       </w:r>
@@ -8482,26 +8148,20 @@
     </w:p>
     <w:p>
       <w:pPr>
-        <w:pStyle w:val="Ttulo3"/>
         <w:ind w:left="0"/>
         <w:rPr>
-          <w:rFonts w:eastAsia="Times New Roman"/>
-          <w:lang w:eastAsia="es-ES_tradnl"/>
-        </w:rPr>
-      </w:pPr>
-      <w:r>
-        <w:rPr>
-          <w:rFonts w:ascii="Apple Color Emoji" w:eastAsia="Times New Roman" w:hAnsi="Apple Color Emoji" w:cs="Apple Color Emoji"/>
-          <w:lang w:eastAsia="es-ES_tradnl"/>
-        </w:rPr>
-        <w:t>✅</w:t>
-      </w:r>
-      <w:r>
-        <w:rPr>
-          <w:rFonts w:eastAsia="Times New Roman"/>
-          <w:lang w:eastAsia="es-ES_tradnl"/>
-        </w:rPr>
-        <w:t xml:space="preserve"> Ventajas de la infraestructura distribuida</w:t>
+          <w:b/>
+          <w:bCs/>
+          <w:lang w:eastAsia="es-ES_tradnl"/>
+        </w:rPr>
+      </w:pPr>
+      <w:r>
+        <w:rPr>
+          <w:b/>
+          <w:bCs/>
+          <w:lang w:eastAsia="es-ES_tradnl"/>
+        </w:rPr>
+        <w:t>Ventajas de la infraestructura distribuida</w:t>
       </w:r>
     </w:p>
     <w:p>
@@ -8604,7 +8264,6 @@
           <w:szCs w:val="24"/>
           <w:lang w:eastAsia="es-ES_tradnl"/>
         </w:rPr>
-        <w:lastRenderedPageBreak/>
         <w:t>Cumplimiento de normativas locales sobre residencia de datos.</w:t>
       </w:r>
     </w:p>
@@ -8632,26 +8291,19 @@
     </w:p>
     <w:p>
       <w:pPr>
-        <w:pStyle w:val="Ttulo3"/>
-        <w:ind w:left="0"/>
-        <w:rPr>
-          <w:rFonts w:eastAsia="Times New Roman"/>
-          <w:lang w:eastAsia="es-ES_tradnl"/>
-        </w:rPr>
-      </w:pPr>
-      <w:r>
-        <w:rPr>
-          <w:rFonts w:ascii="Apple Color Emoji" w:eastAsia="Times New Roman" w:hAnsi="Apple Color Emoji" w:cs="Apple Color Emoji"/>
-          <w:lang w:eastAsia="es-ES_tradnl"/>
-        </w:rPr>
-        <w:t>🏢</w:t>
-      </w:r>
-      <w:r>
-        <w:rPr>
-          <w:rFonts w:eastAsia="Times New Roman"/>
-          <w:lang w:eastAsia="es-ES_tradnl"/>
-        </w:rPr>
-        <w:t xml:space="preserve"> Ejemplo real de aplicación empresarial:</w:t>
+        <w:rPr>
+          <w:b/>
+          <w:bCs/>
+          <w:lang w:eastAsia="es-ES_tradnl"/>
+        </w:rPr>
+      </w:pPr>
+      <w:r>
+        <w:rPr>
+          <w:b/>
+          <w:bCs/>
+          <w:lang w:eastAsia="es-ES_tradnl"/>
+        </w:rPr>
+        <w:t>Ejemplo real de aplicación empresarial:</w:t>
       </w:r>
     </w:p>
     <w:p>
@@ -8670,6 +8322,7 @@
           <w:szCs w:val="24"/>
           <w:lang w:eastAsia="es-ES_tradnl"/>
         </w:rPr>
+        <w:lastRenderedPageBreak/>
         <w:t xml:space="preserve">Una empresa internacional dedicada al </w:t>
       </w:r>
       <w:proofErr w:type="spellStart"/>
@@ -8995,16 +8648,17 @@
     </w:p>
     <w:p>
       <w:pPr>
-        <w:pStyle w:val="Ttulo3"/>
         <w:ind w:left="0"/>
         <w:rPr>
-          <w:rFonts w:eastAsia="Times New Roman"/>
-          <w:lang w:eastAsia="es-ES_tradnl"/>
-        </w:rPr>
-      </w:pPr>
-      <w:r>
-        <w:rPr>
-          <w:rFonts w:eastAsia="Times New Roman"/>
+          <w:b/>
+          <w:bCs/>
+          <w:lang w:eastAsia="es-ES_tradnl"/>
+        </w:rPr>
+      </w:pPr>
+      <w:r>
+        <w:rPr>
+          <w:b/>
+          <w:bCs/>
           <w:lang w:eastAsia="es-ES_tradnl"/>
         </w:rPr>
         <w:t>Debes conocer</w:t>
@@ -9193,19 +8847,19 @@
     </w:p>
     <w:p>
       <w:pPr>
-        <w:pStyle w:val="Ttulo3"/>
         <w:ind w:left="0"/>
         <w:rPr>
-          <w:rFonts w:eastAsia="Times New Roman"/>
-          <w:lang w:eastAsia="es-ES_tradnl"/>
-        </w:rPr>
-      </w:pPr>
-      <w:r>
-        <w:rPr>
-          <w:rFonts w:eastAsia="Times New Roman"/>
-          <w:lang w:eastAsia="es-ES_tradnl"/>
-        </w:rPr>
-        <w:lastRenderedPageBreak/>
+          <w:b/>
+          <w:bCs/>
+          <w:lang w:eastAsia="es-ES_tradnl"/>
+        </w:rPr>
+      </w:pPr>
+      <w:r>
+        <w:rPr>
+          <w:b/>
+          <w:bCs/>
+          <w:lang w:eastAsia="es-ES_tradnl"/>
+        </w:rPr>
         <w:t>Categorías funcionales de servicios en la nube</w:t>
       </w:r>
     </w:p>
@@ -9283,17 +8937,19 @@
     </w:p>
     <w:p>
       <w:pPr>
-        <w:pStyle w:val="Ttulo3"/>
         <w:ind w:left="0"/>
-      </w:pPr>
-      <w:r>
-        <w:rPr>
-          <w:rFonts w:ascii="Apple Color Emoji" w:hAnsi="Apple Color Emoji" w:cs="Apple Color Emoji"/>
-        </w:rPr>
-        <w:t>⚙️</w:t>
-      </w:r>
-      <w:r>
-        <w:t xml:space="preserve"> Cómputo</w:t>
+        <w:rPr>
+          <w:b/>
+          <w:bCs/>
+        </w:rPr>
+      </w:pPr>
+      <w:r>
+        <w:rPr>
+          <w:b/>
+          <w:bCs/>
+        </w:rPr>
+        <w:lastRenderedPageBreak/>
+        <w:t>Cómputo</w:t>
       </w:r>
     </w:p>
     <w:p>
@@ -9466,17 +9122,18 @@
     </w:p>
     <w:p>
       <w:pPr>
-        <w:pStyle w:val="Ttulo3"/>
         <w:ind w:left="0"/>
-      </w:pPr>
-      <w:r>
-        <w:rPr>
-          <w:rFonts w:ascii="Apple Color Emoji" w:hAnsi="Apple Color Emoji" w:cs="Apple Color Emoji"/>
-        </w:rPr>
-        <w:t>💾</w:t>
-      </w:r>
-      <w:r>
-        <w:t xml:space="preserve"> Almacenamiento</w:t>
+        <w:rPr>
+          <w:b/>
+          <w:bCs/>
+        </w:rPr>
+      </w:pPr>
+      <w:r>
+        <w:rPr>
+          <w:b/>
+          <w:bCs/>
+        </w:rPr>
+        <w:t>Almacenamiento</w:t>
       </w:r>
     </w:p>
     <w:p>
@@ -9496,9 +9153,9 @@
         <w:tblLook w:val="04A0" w:firstRow="1" w:lastRow="0" w:firstColumn="1" w:lastColumn="0" w:noHBand="0" w:noVBand="1"/>
       </w:tblPr>
       <w:tblGrid>
-        <w:gridCol w:w="2599"/>
-        <w:gridCol w:w="4118"/>
-        <w:gridCol w:w="3353"/>
+        <w:gridCol w:w="2552"/>
+        <w:gridCol w:w="4130"/>
+        <w:gridCol w:w="3388"/>
       </w:tblGrid>
       <w:tr>
         <w:trPr>
@@ -9515,22 +9172,22 @@
             <w:pPr>
               <w:jc w:val="center"/>
               <w:rPr>
-                <w:sz w:val="21"/>
-                <w:szCs w:val="16"/>
+                <w:sz w:val="20"/>
+                <w:szCs w:val="15"/>
               </w:rPr>
             </w:pPr>
             <w:r>
               <w:rPr>
                 <w:rFonts w:ascii="Apple Color Emoji" w:hAnsi="Apple Color Emoji" w:cs="Apple Color Emoji"/>
-                <w:sz w:val="21"/>
-                <w:szCs w:val="16"/>
+                <w:sz w:val="20"/>
+                <w:szCs w:val="15"/>
               </w:rPr>
               <w:t>📊</w:t>
             </w:r>
             <w:r>
               <w:rPr>
-                <w:sz w:val="21"/>
-                <w:szCs w:val="16"/>
+                <w:sz w:val="20"/>
+                <w:szCs w:val="15"/>
               </w:rPr>
               <w:t xml:space="preserve"> Ejemplos de almacenamiento</w:t>
             </w:r>
@@ -9551,14 +9208,14 @@
             <w:pPr>
               <w:jc w:val="center"/>
               <w:rPr>
-                <w:sz w:val="21"/>
-                <w:szCs w:val="16"/>
+                <w:sz w:val="20"/>
+                <w:szCs w:val="15"/>
               </w:rPr>
             </w:pPr>
             <w:r>
               <w:rPr>
-                <w:sz w:val="21"/>
-                <w:szCs w:val="16"/>
+                <w:sz w:val="20"/>
+                <w:szCs w:val="15"/>
               </w:rPr>
               <w:t>Tipo de almacenamiento</w:t>
             </w:r>
@@ -9576,16 +9233,16 @@
               <w:rPr>
                 <w:b/>
                 <w:bCs/>
-                <w:sz w:val="21"/>
-                <w:szCs w:val="16"/>
+                <w:sz w:val="20"/>
+                <w:szCs w:val="15"/>
               </w:rPr>
             </w:pPr>
             <w:r>
               <w:rPr>
                 <w:b/>
                 <w:bCs/>
-                <w:sz w:val="21"/>
-                <w:szCs w:val="16"/>
+                <w:sz w:val="20"/>
+                <w:szCs w:val="15"/>
               </w:rPr>
               <w:t>Finalidad</w:t>
             </w:r>
@@ -9603,16 +9260,16 @@
               <w:rPr>
                 <w:b/>
                 <w:bCs/>
-                <w:sz w:val="21"/>
-                <w:szCs w:val="16"/>
+                <w:sz w:val="20"/>
+                <w:szCs w:val="15"/>
               </w:rPr>
             </w:pPr>
             <w:r>
               <w:rPr>
                 <w:b/>
                 <w:bCs/>
-                <w:sz w:val="21"/>
-                <w:szCs w:val="16"/>
+                <w:sz w:val="20"/>
+                <w:szCs w:val="15"/>
               </w:rPr>
               <w:t>Ejemplos</w:t>
             </w:r>
@@ -9631,15 +9288,15 @@
               <w:rPr>
                 <w:b w:val="0"/>
                 <w:bCs w:val="0"/>
-                <w:sz w:val="21"/>
-                <w:szCs w:val="16"/>
+                <w:sz w:val="20"/>
+                <w:szCs w:val="15"/>
               </w:rPr>
             </w:pPr>
             <w:r>
               <w:rPr>
                 <w:rStyle w:val="Textoennegrita"/>
-                <w:sz w:val="21"/>
-                <w:szCs w:val="16"/>
+                <w:sz w:val="20"/>
+                <w:szCs w:val="15"/>
               </w:rPr>
               <w:t>Objetos</w:t>
             </w:r>
@@ -9654,30 +9311,30 @@
             <w:pPr>
               <w:cnfStyle w:val="000000000000" w:firstRow="0" w:lastRow="0" w:firstColumn="0" w:lastColumn="0" w:oddVBand="0" w:evenVBand="0" w:oddHBand="0" w:evenHBand="0" w:firstRowFirstColumn="0" w:firstRowLastColumn="0" w:lastRowFirstColumn="0" w:lastRowLastColumn="0"/>
               <w:rPr>
-                <w:sz w:val="21"/>
-                <w:szCs w:val="16"/>
+                <w:sz w:val="20"/>
+                <w:szCs w:val="15"/>
               </w:rPr>
             </w:pPr>
             <w:r>
               <w:rPr>
-                <w:sz w:val="21"/>
-                <w:szCs w:val="16"/>
+                <w:sz w:val="20"/>
+                <w:szCs w:val="15"/>
               </w:rPr>
               <w:t xml:space="preserve">Archivos no estructurados (imágenes, </w:t>
             </w:r>
             <w:proofErr w:type="spellStart"/>
             <w:r>
               <w:rPr>
-                <w:sz w:val="21"/>
-                <w:szCs w:val="16"/>
+                <w:sz w:val="20"/>
+                <w:szCs w:val="15"/>
               </w:rPr>
               <w:t>backups</w:t>
             </w:r>
             <w:proofErr w:type="spellEnd"/>
             <w:r>
               <w:rPr>
-                <w:sz w:val="21"/>
-                <w:szCs w:val="16"/>
+                <w:sz w:val="20"/>
+                <w:szCs w:val="15"/>
               </w:rPr>
               <w:t>)</w:t>
             </w:r>
@@ -9692,14 +9349,14 @@
             <w:pPr>
               <w:cnfStyle w:val="000000000000" w:firstRow="0" w:lastRow="0" w:firstColumn="0" w:lastColumn="0" w:oddVBand="0" w:evenVBand="0" w:oddHBand="0" w:evenHBand="0" w:firstRowFirstColumn="0" w:firstRowLastColumn="0" w:lastRowFirstColumn="0" w:lastRowLastColumn="0"/>
               <w:rPr>
-                <w:sz w:val="21"/>
-                <w:szCs w:val="16"/>
+                <w:sz w:val="20"/>
+                <w:szCs w:val="15"/>
               </w:rPr>
             </w:pPr>
             <w:r>
               <w:rPr>
-                <w:sz w:val="21"/>
-                <w:szCs w:val="16"/>
+                <w:sz w:val="20"/>
+                <w:szCs w:val="15"/>
               </w:rPr>
               <w:t>Amazon S3, Azure Blob Storage</w:t>
             </w:r>
@@ -9719,15 +9376,15 @@
           <w:p>
             <w:pPr>
               <w:rPr>
-                <w:sz w:val="21"/>
-                <w:szCs w:val="16"/>
+                <w:sz w:val="20"/>
+                <w:szCs w:val="15"/>
               </w:rPr>
             </w:pPr>
             <w:r>
               <w:rPr>
                 <w:rStyle w:val="Textoennegrita"/>
-                <w:sz w:val="21"/>
-                <w:szCs w:val="16"/>
+                <w:sz w:val="20"/>
+                <w:szCs w:val="15"/>
               </w:rPr>
               <w:t>Bloques</w:t>
             </w:r>
@@ -9742,30 +9399,30 @@
             <w:pPr>
               <w:cnfStyle w:val="000000100000" w:firstRow="0" w:lastRow="0" w:firstColumn="0" w:lastColumn="0" w:oddVBand="0" w:evenVBand="0" w:oddHBand="1" w:evenHBand="0" w:firstRowFirstColumn="0" w:firstRowLastColumn="0" w:lastRowFirstColumn="0" w:lastRowLastColumn="0"/>
               <w:rPr>
-                <w:sz w:val="21"/>
-                <w:szCs w:val="16"/>
+                <w:sz w:val="20"/>
+                <w:szCs w:val="15"/>
               </w:rPr>
             </w:pPr>
             <w:r>
               <w:rPr>
-                <w:sz w:val="21"/>
-                <w:szCs w:val="16"/>
+                <w:sz w:val="20"/>
+                <w:szCs w:val="15"/>
               </w:rPr>
               <w:t xml:space="preserve">Discos para </w:t>
             </w:r>
             <w:proofErr w:type="spellStart"/>
             <w:r>
               <w:rPr>
-                <w:sz w:val="21"/>
-                <w:szCs w:val="16"/>
+                <w:sz w:val="20"/>
+                <w:szCs w:val="15"/>
               </w:rPr>
               <w:t>VMs</w:t>
             </w:r>
             <w:proofErr w:type="spellEnd"/>
             <w:r>
               <w:rPr>
-                <w:sz w:val="21"/>
-                <w:szCs w:val="16"/>
+                <w:sz w:val="20"/>
+                <w:szCs w:val="15"/>
               </w:rPr>
               <w:t>, bases de datos</w:t>
             </w:r>
@@ -9780,30 +9437,30 @@
             <w:pPr>
               <w:cnfStyle w:val="000000100000" w:firstRow="0" w:lastRow="0" w:firstColumn="0" w:lastColumn="0" w:oddVBand="0" w:evenVBand="0" w:oddHBand="1" w:evenHBand="0" w:firstRowFirstColumn="0" w:firstRowLastColumn="0" w:lastRowFirstColumn="0" w:lastRowLastColumn="0"/>
               <w:rPr>
-                <w:sz w:val="21"/>
-                <w:szCs w:val="16"/>
+                <w:sz w:val="20"/>
+                <w:szCs w:val="15"/>
               </w:rPr>
             </w:pPr>
             <w:r>
               <w:rPr>
-                <w:sz w:val="21"/>
-                <w:szCs w:val="16"/>
+                <w:sz w:val="20"/>
+                <w:szCs w:val="15"/>
               </w:rPr>
               <w:t xml:space="preserve">Amazon EBS, Google </w:t>
             </w:r>
             <w:proofErr w:type="spellStart"/>
             <w:r>
               <w:rPr>
-                <w:sz w:val="21"/>
-                <w:szCs w:val="16"/>
+                <w:sz w:val="20"/>
+                <w:szCs w:val="15"/>
               </w:rPr>
               <w:t>Persistent</w:t>
             </w:r>
             <w:proofErr w:type="spellEnd"/>
             <w:r>
               <w:rPr>
-                <w:sz w:val="21"/>
-                <w:szCs w:val="16"/>
+                <w:sz w:val="20"/>
+                <w:szCs w:val="15"/>
               </w:rPr>
               <w:t xml:space="preserve"> Disk</w:t>
             </w:r>
@@ -9820,15 +9477,15 @@
           <w:p>
             <w:pPr>
               <w:rPr>
-                <w:sz w:val="21"/>
-                <w:szCs w:val="16"/>
+                <w:sz w:val="20"/>
+                <w:szCs w:val="15"/>
               </w:rPr>
             </w:pPr>
             <w:r>
               <w:rPr>
                 <w:rStyle w:val="Textoennegrita"/>
-                <w:sz w:val="21"/>
-                <w:szCs w:val="16"/>
+                <w:sz w:val="20"/>
+                <w:szCs w:val="15"/>
               </w:rPr>
               <w:t>Archivos</w:t>
             </w:r>
@@ -9843,14 +9500,14 @@
             <w:pPr>
               <w:cnfStyle w:val="000000000000" w:firstRow="0" w:lastRow="0" w:firstColumn="0" w:lastColumn="0" w:oddVBand="0" w:evenVBand="0" w:oddHBand="0" w:evenHBand="0" w:firstRowFirstColumn="0" w:firstRowLastColumn="0" w:lastRowFirstColumn="0" w:lastRowLastColumn="0"/>
               <w:rPr>
-                <w:sz w:val="21"/>
-                <w:szCs w:val="16"/>
+                <w:sz w:val="20"/>
+                <w:szCs w:val="15"/>
               </w:rPr>
             </w:pPr>
             <w:r>
               <w:rPr>
-                <w:sz w:val="21"/>
-                <w:szCs w:val="16"/>
+                <w:sz w:val="20"/>
+                <w:szCs w:val="15"/>
               </w:rPr>
               <w:t>Acceso compartido en red</w:t>
             </w:r>
@@ -9865,14 +9522,14 @@
             <w:pPr>
               <w:cnfStyle w:val="000000000000" w:firstRow="0" w:lastRow="0" w:firstColumn="0" w:lastColumn="0" w:oddVBand="0" w:evenVBand="0" w:oddHBand="0" w:evenHBand="0" w:firstRowFirstColumn="0" w:firstRowLastColumn="0" w:lastRowFirstColumn="0" w:lastRowLastColumn="0"/>
               <w:rPr>
-                <w:sz w:val="21"/>
-                <w:szCs w:val="16"/>
+                <w:sz w:val="20"/>
+                <w:szCs w:val="15"/>
               </w:rPr>
             </w:pPr>
             <w:r>
               <w:rPr>
-                <w:sz w:val="21"/>
-                <w:szCs w:val="16"/>
+                <w:sz w:val="20"/>
+                <w:szCs w:val="15"/>
               </w:rPr>
               <w:t>Amazon EFS, Azure Files</w:t>
             </w:r>
@@ -9892,15 +9549,15 @@
           <w:p>
             <w:pPr>
               <w:rPr>
-                <w:sz w:val="21"/>
-                <w:szCs w:val="16"/>
+                <w:sz w:val="20"/>
+                <w:szCs w:val="15"/>
               </w:rPr>
             </w:pPr>
             <w:r>
               <w:rPr>
                 <w:rStyle w:val="Textoennegrita"/>
-                <w:sz w:val="21"/>
-                <w:szCs w:val="16"/>
+                <w:sz w:val="20"/>
+                <w:szCs w:val="15"/>
               </w:rPr>
               <w:t>Archivado</w:t>
             </w:r>
@@ -9915,14 +9572,14 @@
             <w:pPr>
               <w:cnfStyle w:val="000000100000" w:firstRow="0" w:lastRow="0" w:firstColumn="0" w:lastColumn="0" w:oddVBand="0" w:evenVBand="0" w:oddHBand="1" w:evenHBand="0" w:firstRowFirstColumn="0" w:firstRowLastColumn="0" w:lastRowFirstColumn="0" w:lastRowLastColumn="0"/>
               <w:rPr>
-                <w:sz w:val="21"/>
-                <w:szCs w:val="16"/>
+                <w:sz w:val="20"/>
+                <w:szCs w:val="15"/>
               </w:rPr>
             </w:pPr>
             <w:r>
               <w:rPr>
-                <w:sz w:val="21"/>
-                <w:szCs w:val="16"/>
+                <w:sz w:val="20"/>
+                <w:szCs w:val="15"/>
               </w:rPr>
               <w:t>Almacenamiento a largo plazo y bajo coste</w:t>
             </w:r>
@@ -9937,14 +9594,14 @@
             <w:pPr>
               <w:cnfStyle w:val="000000100000" w:firstRow="0" w:lastRow="0" w:firstColumn="0" w:lastColumn="0" w:oddVBand="0" w:evenVBand="0" w:oddHBand="1" w:evenHBand="0" w:firstRowFirstColumn="0" w:firstRowLastColumn="0" w:lastRowFirstColumn="0" w:lastRowLastColumn="0"/>
               <w:rPr>
-                <w:sz w:val="21"/>
-                <w:szCs w:val="16"/>
+                <w:sz w:val="20"/>
+                <w:szCs w:val="15"/>
               </w:rPr>
             </w:pPr>
             <w:r>
               <w:rPr>
-                <w:sz w:val="21"/>
-                <w:szCs w:val="16"/>
+                <w:sz w:val="20"/>
+                <w:szCs w:val="15"/>
               </w:rPr>
               <w:t>AWS Glacier, Azure Archive Storage</w:t>
             </w:r>
@@ -9990,17 +9647,18 @@
     </w:p>
     <w:p>
       <w:pPr>
-        <w:pStyle w:val="Ttulo3"/>
         <w:ind w:left="0"/>
-      </w:pPr>
-      <w:r>
-        <w:rPr>
-          <w:rFonts w:ascii="Apple Color Emoji" w:hAnsi="Apple Color Emoji" w:cs="Apple Color Emoji"/>
-        </w:rPr>
-        <w:t>🌐</w:t>
-      </w:r>
-      <w:r>
-        <w:t xml:space="preserve"> Redes</w:t>
+        <w:rPr>
+          <w:b/>
+          <w:bCs/>
+        </w:rPr>
+      </w:pPr>
+      <w:r>
+        <w:rPr>
+          <w:b/>
+          <w:bCs/>
+        </w:rPr>
+        <w:t>Redes</w:t>
       </w:r>
     </w:p>
     <w:p>
@@ -10088,7 +9746,6 @@
         <w:rPr>
           <w:rStyle w:val="Textoennegrita"/>
         </w:rPr>
-        <w:lastRenderedPageBreak/>
         <w:t xml:space="preserve">VPN y Direct </w:t>
       </w:r>
       <w:proofErr w:type="spellStart"/>
@@ -10158,17 +9815,17 @@
     </w:p>
     <w:p>
       <w:pPr>
-        <w:pStyle w:val="Ttulo3"/>
-        <w:ind w:left="0"/>
-      </w:pPr>
-      <w:r>
-        <w:rPr>
-          <w:rFonts w:ascii="Apple Color Emoji" w:hAnsi="Apple Color Emoji" w:cs="Apple Color Emoji"/>
-        </w:rPr>
-        <w:t>🗃️</w:t>
-      </w:r>
-      <w:r>
-        <w:t xml:space="preserve"> Bases de datos</w:t>
+        <w:rPr>
+          <w:b/>
+          <w:bCs/>
+        </w:rPr>
+      </w:pPr>
+      <w:r>
+        <w:rPr>
+          <w:b/>
+          <w:bCs/>
+        </w:rPr>
+        <w:t>Bases de datos</w:t>
       </w:r>
     </w:p>
     <w:p>
@@ -10178,6 +9835,7 @@
         <w:ind w:left="0"/>
       </w:pPr>
       <w:r>
+        <w:lastRenderedPageBreak/>
         <w:t>Sistemas de almacenamiento estructurado y semiestructurado, totalmente gestionados y escalables.</w:t>
       </w:r>
     </w:p>
@@ -10643,17 +10301,18 @@
     </w:p>
     <w:p>
       <w:pPr>
-        <w:pStyle w:val="Ttulo3"/>
         <w:ind w:left="0"/>
-      </w:pPr>
-      <w:r>
-        <w:rPr>
-          <w:rFonts w:ascii="Apple Color Emoji" w:hAnsi="Apple Color Emoji" w:cs="Apple Color Emoji"/>
-        </w:rPr>
-        <w:t>🔐</w:t>
-      </w:r>
-      <w:r>
-        <w:t xml:space="preserve"> Seguridad</w:t>
+        <w:rPr>
+          <w:b/>
+          <w:bCs/>
+        </w:rPr>
+      </w:pPr>
+      <w:r>
+        <w:rPr>
+          <w:b/>
+          <w:bCs/>
+        </w:rPr>
+        <w:t>Seguridad</w:t>
       </w:r>
     </w:p>
     <w:p>
@@ -10780,17 +10439,18 @@
     </w:p>
     <w:p>
       <w:pPr>
-        <w:pStyle w:val="Ttulo3"/>
         <w:ind w:left="0"/>
-      </w:pPr>
-      <w:r>
-        <w:rPr>
-          <w:rFonts w:ascii="Apple Color Emoji" w:hAnsi="Apple Color Emoji" w:cs="Apple Color Emoji"/>
-        </w:rPr>
-        <w:t>📊</w:t>
-      </w:r>
-      <w:r>
-        <w:t xml:space="preserve"> Monitorización y gestión</w:t>
+        <w:rPr>
+          <w:b/>
+          <w:bCs/>
+        </w:rPr>
+      </w:pPr>
+      <w:r>
+        <w:rPr>
+          <w:b/>
+          <w:bCs/>
+        </w:rPr>
+        <w:t>Monitorización y gestión</w:t>
       </w:r>
     </w:p>
     <w:p>
@@ -10923,18 +10583,18 @@
     </w:p>
     <w:p>
       <w:pPr>
-        <w:pStyle w:val="Ttulo3"/>
         <w:ind w:left="0"/>
-      </w:pPr>
-      <w:r>
-        <w:rPr>
-          <w:rFonts w:ascii="Apple Color Emoji" w:hAnsi="Apple Color Emoji" w:cs="Apple Color Emoji"/>
-        </w:rPr>
-        <w:lastRenderedPageBreak/>
-        <w:t>🛠️</w:t>
-      </w:r>
-      <w:r>
-        <w:t xml:space="preserve"> DevOps e infraestructura como código</w:t>
+        <w:rPr>
+          <w:b/>
+          <w:bCs/>
+        </w:rPr>
+      </w:pPr>
+      <w:r>
+        <w:rPr>
+          <w:b/>
+          <w:bCs/>
+        </w:rPr>
+        <w:t>DevOps e infraestructura como código</w:t>
       </w:r>
     </w:p>
     <w:p>
@@ -11045,6 +10705,7 @@
           <w:rStyle w:val="Textoennegrita"/>
           <w:rFonts w:eastAsiaTheme="majorEastAsia"/>
         </w:rPr>
+        <w:lastRenderedPageBreak/>
         <w:t>Ejemplo</w:t>
       </w:r>
       <w:r>
@@ -11134,11 +10795,6 @@
           </wp:inline>
         </w:drawing>
       </w:r>
-    </w:p>
-    <w:p>
-      <w:pPr>
-        <w:pStyle w:val="NormalWeb"/>
-      </w:pPr>
       <w:r>
         <w:rPr>
           <w:noProof/>
@@ -11179,11 +10835,6 @@
           </wp:inline>
         </w:drawing>
       </w:r>
-    </w:p>
-    <w:p>
-      <w:pPr>
-        <w:pStyle w:val="NormalWeb"/>
-      </w:pPr>
       <w:r>
         <w:rPr>
           <w:noProof/>
@@ -11224,11 +10875,6 @@
           </wp:inline>
         </w:drawing>
       </w:r>
-    </w:p>
-    <w:p>
-      <w:pPr>
-        <w:pStyle w:val="NormalWeb"/>
-      </w:pPr>
       <w:r>
         <w:rPr>
           <w:noProof/>
@@ -11269,16 +10915,10 @@
           </wp:inline>
         </w:drawing>
       </w:r>
-    </w:p>
-    <w:p>
-      <w:pPr>
-        <w:pStyle w:val="NormalWeb"/>
-      </w:pPr>
       <w:r>
         <w:rPr>
           <w:noProof/>
         </w:rPr>
-        <w:lastRenderedPageBreak/>
         <w:drawing>
           <wp:inline distT="0" distB="0" distL="0" distR="0" wp14:anchorId="760A4025" wp14:editId="024BBE76">
             <wp:extent cx="6188710" cy="981710"/>
@@ -11315,11 +10955,6 @@
           </wp:inline>
         </w:drawing>
       </w:r>
-    </w:p>
-    <w:p>
-      <w:pPr>
-        <w:pStyle w:val="NormalWeb"/>
-      </w:pPr>
       <w:r>
         <w:rPr>
           <w:noProof/>
@@ -11375,6 +11010,7 @@
           <w:rFonts w:eastAsia="Times New Roman"/>
           <w:lang w:eastAsia="es-ES_tradnl"/>
         </w:rPr>
+        <w:lastRenderedPageBreak/>
         <w:t>2.4 Automatización e Infraestructura como Código (</w:t>
       </w:r>
       <w:proofErr w:type="spellStart"/>
@@ -11578,16 +11214,17 @@
     </w:p>
     <w:p>
       <w:pPr>
-        <w:pStyle w:val="Ttulo3"/>
         <w:ind w:left="0"/>
         <w:rPr>
-          <w:rFonts w:eastAsia="Times New Roman"/>
-          <w:lang w:eastAsia="es-ES_tradnl"/>
-        </w:rPr>
-      </w:pPr>
-      <w:r>
-        <w:rPr>
-          <w:rFonts w:eastAsia="Times New Roman"/>
+          <w:b/>
+          <w:bCs/>
+          <w:lang w:eastAsia="es-ES_tradnl"/>
+        </w:rPr>
+      </w:pPr>
+      <w:r>
+        <w:rPr>
+          <w:b/>
+          <w:bCs/>
           <w:lang w:eastAsia="es-ES_tradnl"/>
         </w:rPr>
         <w:t>Infraestructura como Código (</w:t>
@@ -11595,7 +11232,8 @@
       <w:proofErr w:type="spellStart"/>
       <w:r>
         <w:rPr>
-          <w:rFonts w:eastAsia="Times New Roman"/>
+          <w:b/>
+          <w:bCs/>
           <w:lang w:eastAsia="es-ES_tradnl"/>
         </w:rPr>
         <w:t>IaC</w:t>
@@ -11603,7 +11241,8 @@
       <w:proofErr w:type="spellEnd"/>
       <w:r>
         <w:rPr>
-          <w:rFonts w:eastAsia="Times New Roman"/>
+          <w:b/>
+          <w:bCs/>
           <w:lang w:eastAsia="es-ES_tradnl"/>
         </w:rPr>
         <w:t>): Automatización de entornos en la nube</w:t>
@@ -11761,16 +11400,17 @@
     </w:p>
     <w:p>
       <w:pPr>
-        <w:pStyle w:val="Ttulo3"/>
         <w:ind w:left="0"/>
         <w:rPr>
-          <w:rFonts w:eastAsia="Times New Roman"/>
-          <w:lang w:eastAsia="es-ES_tradnl"/>
-        </w:rPr>
-      </w:pPr>
-      <w:r>
-        <w:rPr>
-          <w:rFonts w:eastAsia="Times New Roman"/>
+          <w:b/>
+          <w:bCs/>
+          <w:lang w:eastAsia="es-ES_tradnl"/>
+        </w:rPr>
+      </w:pPr>
+      <w:r>
+        <w:rPr>
+          <w:b/>
+          <w:bCs/>
           <w:lang w:eastAsia="es-ES_tradnl"/>
         </w:rPr>
         <w:t xml:space="preserve">¿Cómo funciona la </w:t>
@@ -11778,7 +11418,8 @@
       <w:proofErr w:type="spellStart"/>
       <w:r>
         <w:rPr>
-          <w:rFonts w:eastAsia="Times New Roman"/>
+          <w:b/>
+          <w:bCs/>
           <w:lang w:eastAsia="es-ES_tradnl"/>
         </w:rPr>
         <w:t>IaC</w:t>
@@ -11786,7 +11427,8 @@
       <w:proofErr w:type="spellEnd"/>
       <w:r>
         <w:rPr>
-          <w:rFonts w:eastAsia="Times New Roman"/>
+          <w:b/>
+          <w:bCs/>
           <w:lang w:eastAsia="es-ES_tradnl"/>
         </w:rPr>
         <w:t>?</w:t>
@@ -11867,17 +11509,16 @@
     </w:p>
     <w:p>
       <w:pPr>
-        <w:pStyle w:val="Ttulo3"/>
-        <w:spacing w:before="0"/>
-        <w:ind w:left="0"/>
-        <w:rPr>
-          <w:rFonts w:eastAsia="Times New Roman"/>
-          <w:lang w:eastAsia="es-ES_tradnl"/>
-        </w:rPr>
-      </w:pPr>
-      <w:r>
-        <w:rPr>
-          <w:rFonts w:eastAsia="Times New Roman"/>
+        <w:rPr>
+          <w:b/>
+          <w:bCs/>
+          <w:lang w:eastAsia="es-ES_tradnl"/>
+        </w:rPr>
+      </w:pPr>
+      <w:r>
+        <w:rPr>
+          <w:b/>
+          <w:bCs/>
           <w:lang w:eastAsia="es-ES_tradnl"/>
         </w:rPr>
         <w:t>Proceso típico:</w:t>
@@ -11996,7 +11637,6 @@
           <w:szCs w:val="24"/>
           <w:lang w:eastAsia="es-ES_tradnl"/>
         </w:rPr>
-        <w:lastRenderedPageBreak/>
         <w:t xml:space="preserve">Una </w:t>
       </w:r>
       <w:r>
@@ -12226,6 +11866,7 @@
           <w:szCs w:val="24"/>
           <w:lang w:eastAsia="es-ES_tradnl"/>
         </w:rPr>
+        <w:lastRenderedPageBreak/>
         <w:drawing>
           <wp:inline distT="0" distB="0" distL="0" distR="0" wp14:anchorId="578F7B07" wp14:editId="366FAAF6">
             <wp:extent cx="6188710" cy="1375410"/>
@@ -12265,16 +11906,17 @@
     </w:p>
     <w:p>
       <w:pPr>
-        <w:pStyle w:val="Ttulo3"/>
         <w:ind w:left="0"/>
         <w:rPr>
-          <w:rFonts w:eastAsia="Times New Roman"/>
-          <w:lang w:eastAsia="es-ES_tradnl"/>
-        </w:rPr>
-      </w:pPr>
-      <w:r>
-        <w:rPr>
-          <w:rFonts w:eastAsia="Times New Roman"/>
+          <w:b/>
+          <w:bCs/>
+          <w:lang w:eastAsia="es-ES_tradnl"/>
+        </w:rPr>
+      </w:pPr>
+      <w:r>
+        <w:rPr>
+          <w:b/>
+          <w:bCs/>
           <w:lang w:eastAsia="es-ES_tradnl"/>
         </w:rPr>
         <w:t xml:space="preserve">¿Por qué es importante </w:t>
@@ -12282,7 +11924,8 @@
       <w:proofErr w:type="spellStart"/>
       <w:r>
         <w:rPr>
-          <w:rFonts w:eastAsia="Times New Roman"/>
+          <w:b/>
+          <w:bCs/>
           <w:lang w:eastAsia="es-ES_tradnl"/>
         </w:rPr>
         <w:t>IaC</w:t>
@@ -12290,7 +11933,8 @@
       <w:proofErr w:type="spellEnd"/>
       <w:r>
         <w:rPr>
-          <w:rFonts w:eastAsia="Times New Roman"/>
+          <w:b/>
+          <w:bCs/>
           <w:lang w:eastAsia="es-ES_tradnl"/>
         </w:rPr>
         <w:t>?</w:t>
@@ -12498,16 +12142,17 @@
     </w:p>
     <w:p>
       <w:pPr>
-        <w:pStyle w:val="Ttulo3"/>
         <w:ind w:left="0"/>
         <w:rPr>
-          <w:rFonts w:eastAsia="Times New Roman"/>
-          <w:lang w:eastAsia="es-ES_tradnl"/>
-        </w:rPr>
-      </w:pPr>
-      <w:r>
-        <w:rPr>
-          <w:rFonts w:eastAsia="Times New Roman"/>
+          <w:b/>
+          <w:bCs/>
+          <w:lang w:eastAsia="es-ES_tradnl"/>
+        </w:rPr>
+      </w:pPr>
+      <w:r>
+        <w:rPr>
+          <w:b/>
+          <w:bCs/>
           <w:lang w:eastAsia="es-ES_tradnl"/>
         </w:rPr>
         <w:t>Debes conocer</w:t>
@@ -12647,7 +12292,6 @@
         <w:rPr>
           <w:noProof/>
         </w:rPr>
-        <w:lastRenderedPageBreak/>
         <w:drawing>
           <wp:inline distT="0" distB="0" distL="0" distR="0" wp14:anchorId="74FE7D06" wp14:editId="620F5154">
             <wp:extent cx="6188710" cy="1914525"/>
@@ -12738,6 +12382,7 @@
         <w:rPr>
           <w:noProof/>
         </w:rPr>
+        <w:lastRenderedPageBreak/>
         <w:drawing>
           <wp:inline distT="0" distB="0" distL="0" distR="0" wp14:anchorId="004AE7AF" wp14:editId="54A6C6F7">
             <wp:extent cx="6188710" cy="1054735"/>
@@ -13774,9 +13419,9 @@
       <w:lvlJc w:val="left"/>
       <w:pPr>
         <w:tabs>
-          <w:tab w:val="num" w:pos="720"/>
-        </w:tabs>
-        <w:ind w:left="720" w:hanging="360"/>
+          <w:tab w:val="num" w:pos="360"/>
+        </w:tabs>
+        <w:ind w:left="360" w:hanging="360"/>
       </w:pPr>
       <w:rPr>
         <w:rFonts w:ascii="Symbol" w:hAnsi="Symbol" w:hint="default"/>
@@ -13790,9 +13435,9 @@
       <w:lvlJc w:val="left"/>
       <w:pPr>
         <w:tabs>
-          <w:tab w:val="num" w:pos="1440"/>
-        </w:tabs>
-        <w:ind w:left="1440" w:hanging="360"/>
+          <w:tab w:val="num" w:pos="1080"/>
+        </w:tabs>
+        <w:ind w:left="1080" w:hanging="360"/>
       </w:pPr>
       <w:rPr>
         <w:rFonts w:ascii="Courier New" w:hAnsi="Courier New" w:hint="default"/>
@@ -13806,9 +13451,9 @@
       <w:lvlJc w:val="left"/>
       <w:pPr>
         <w:tabs>
-          <w:tab w:val="num" w:pos="2160"/>
-        </w:tabs>
-        <w:ind w:left="2160" w:hanging="360"/>
+          <w:tab w:val="num" w:pos="1800"/>
+        </w:tabs>
+        <w:ind w:left="1800" w:hanging="360"/>
       </w:pPr>
       <w:rPr>
         <w:rFonts w:ascii="Wingdings" w:hAnsi="Wingdings" w:hint="default"/>
@@ -13822,9 +13467,9 @@
       <w:lvlJc w:val="left"/>
       <w:pPr>
         <w:tabs>
-          <w:tab w:val="num" w:pos="2880"/>
-        </w:tabs>
-        <w:ind w:left="2880" w:hanging="360"/>
+          <w:tab w:val="num" w:pos="2520"/>
+        </w:tabs>
+        <w:ind w:left="2520" w:hanging="360"/>
       </w:pPr>
       <w:rPr>
         <w:rFonts w:ascii="Wingdings" w:hAnsi="Wingdings" w:hint="default"/>
@@ -13838,9 +13483,9 @@
       <w:lvlJc w:val="left"/>
       <w:pPr>
         <w:tabs>
-          <w:tab w:val="num" w:pos="3600"/>
-        </w:tabs>
-        <w:ind w:left="3600" w:hanging="360"/>
+          <w:tab w:val="num" w:pos="3240"/>
+        </w:tabs>
+        <w:ind w:left="3240" w:hanging="360"/>
       </w:pPr>
       <w:rPr>
         <w:rFonts w:ascii="Wingdings" w:hAnsi="Wingdings" w:hint="default"/>
@@ -13854,9 +13499,9 @@
       <w:lvlJc w:val="left"/>
       <w:pPr>
         <w:tabs>
-          <w:tab w:val="num" w:pos="4320"/>
-        </w:tabs>
-        <w:ind w:left="4320" w:hanging="360"/>
+          <w:tab w:val="num" w:pos="3960"/>
+        </w:tabs>
+        <w:ind w:left="3960" w:hanging="360"/>
       </w:pPr>
       <w:rPr>
         <w:rFonts w:ascii="Wingdings" w:hAnsi="Wingdings" w:hint="default"/>
@@ -13870,9 +13515,9 @@
       <w:lvlJc w:val="left"/>
       <w:pPr>
         <w:tabs>
-          <w:tab w:val="num" w:pos="5040"/>
-        </w:tabs>
-        <w:ind w:left="5040" w:hanging="360"/>
+          <w:tab w:val="num" w:pos="4680"/>
+        </w:tabs>
+        <w:ind w:left="4680" w:hanging="360"/>
       </w:pPr>
       <w:rPr>
         <w:rFonts w:ascii="Wingdings" w:hAnsi="Wingdings" w:hint="default"/>
@@ -13886,9 +13531,9 @@
       <w:lvlJc w:val="left"/>
       <w:pPr>
         <w:tabs>
-          <w:tab w:val="num" w:pos="5760"/>
-        </w:tabs>
-        <w:ind w:left="5760" w:hanging="360"/>
+          <w:tab w:val="num" w:pos="5400"/>
+        </w:tabs>
+        <w:ind w:left="5400" w:hanging="360"/>
       </w:pPr>
       <w:rPr>
         <w:rFonts w:ascii="Wingdings" w:hAnsi="Wingdings" w:hint="default"/>
@@ -13902,9 +13547,9 @@
       <w:lvlJc w:val="left"/>
       <w:pPr>
         <w:tabs>
-          <w:tab w:val="num" w:pos="6480"/>
-        </w:tabs>
-        <w:ind w:left="6480" w:hanging="360"/>
+          <w:tab w:val="num" w:pos="6120"/>
+        </w:tabs>
+        <w:ind w:left="6120" w:hanging="360"/>
       </w:pPr>
       <w:rPr>
         <w:rFonts w:ascii="Wingdings" w:hAnsi="Wingdings" w:hint="default"/>
@@ -21911,19 +21556,6 @@
 </file>
 
 <file path=customXml/item1.xml><?xml version="1.0" encoding="utf-8"?>
-<p:properties xmlns:p="http://schemas.microsoft.com/office/2006/metadata/properties" xmlns:xsi="http://www.w3.org/2001/XMLSchema-instance" xmlns:pc="http://schemas.microsoft.com/office/infopath/2007/PartnerControls">
-  <documentManagement>
-    <_ip_UnifiedCompliancePolicyUIAction xmlns="http://schemas.microsoft.com/sharepoint/v3" xsi:nil="true"/>
-    <_ip_UnifiedCompliancePolicyProperties xmlns="http://schemas.microsoft.com/sharepoint/v3" xsi:nil="true"/>
-    <TaxCatchAll xmlns="38de0ec0-4312-429b-9ba4-a6f7899b86f2" xsi:nil="true"/>
-    <lcf76f155ced4ddcb4097134ff3c332f xmlns="21705155-b4ce-4c69-95dc-4fd6cb8c5571">
-      <Terms xmlns="http://schemas.microsoft.com/office/infopath/2007/PartnerControls"/>
-    </lcf76f155ced4ddcb4097134ff3c332f>
-  </documentManagement>
-</p:properties>
-</file>
-
-<file path=customXml/item2.xml><?xml version="1.0" encoding="utf-8"?>
 <ct:contentTypeSchema xmlns:ct="http://schemas.microsoft.com/office/2006/metadata/contentType" xmlns:ma="http://schemas.microsoft.com/office/2006/metadata/properties/metaAttributes" ct:_="" ma:_="" ma:contentTypeName="Document" ma:contentTypeID="0x0101001867FBBEFD40724CA20725D6B3094130" ma:contentTypeVersion="14" ma:contentTypeDescription="Create a new document." ma:contentTypeScope="" ma:versionID="b563ecc397a77cd5d82b22a852f9d63c">
   <xsd:schema xmlns:xsd="http://www.w3.org/2001/XMLSchema" xmlns:xs="http://www.w3.org/2001/XMLSchema" xmlns:p="http://schemas.microsoft.com/office/2006/metadata/properties" xmlns:ns1="http://schemas.microsoft.com/sharepoint/v3" xmlns:ns2="21705155-b4ce-4c69-95dc-4fd6cb8c5571" xmlns:ns3="38de0ec0-4312-429b-9ba4-a6f7899b86f2" targetNamespace="http://schemas.microsoft.com/office/2006/metadata/properties" ma:root="true" ma:fieldsID="514fef1a96c1431b584933149cb0dc9f" ns1:_="" ns2:_="" ns3:_="">
     <xsd:import namespace="http://schemas.microsoft.com/sharepoint/v3"/>
@@ -22141,6 +21773,19 @@
 </ct:contentTypeSchema>
 </file>
 
+<file path=customXml/item2.xml><?xml version="1.0" encoding="utf-8"?>
+<p:properties xmlns:p="http://schemas.microsoft.com/office/2006/metadata/properties" xmlns:xsi="http://www.w3.org/2001/XMLSchema-instance" xmlns:pc="http://schemas.microsoft.com/office/infopath/2007/PartnerControls">
+  <documentManagement>
+    <_ip_UnifiedCompliancePolicyUIAction xmlns="http://schemas.microsoft.com/sharepoint/v3" xsi:nil="true"/>
+    <_ip_UnifiedCompliancePolicyProperties xmlns="http://schemas.microsoft.com/sharepoint/v3" xsi:nil="true"/>
+    <TaxCatchAll xmlns="38de0ec0-4312-429b-9ba4-a6f7899b86f2" xsi:nil="true"/>
+    <lcf76f155ced4ddcb4097134ff3c332f xmlns="21705155-b4ce-4c69-95dc-4fd6cb8c5571">
+      <Terms xmlns="http://schemas.microsoft.com/office/infopath/2007/PartnerControls"/>
+    </lcf76f155ced4ddcb4097134ff3c332f>
+  </documentManagement>
+</p:properties>
+</file>
+
 <file path=customXml/item3.xml><?xml version="1.0" encoding="utf-8"?>
 <?mso-contentType ?>
 <FormTemplates xmlns="http://schemas.microsoft.com/sharepoint/v3/contenttype/forms">
@@ -22151,18 +21796,6 @@
 </file>
 
 <file path=customXml/itemProps1.xml><?xml version="1.0" encoding="utf-8"?>
-<ds:datastoreItem xmlns:ds="http://schemas.openxmlformats.org/officeDocument/2006/customXml" ds:itemID="{1B72C47D-52A6-4002-B691-BB8C99CF8F2B}">
-  <ds:schemaRefs>
-    <ds:schemaRef ds:uri="http://schemas.microsoft.com/office/2006/metadata/properties"/>
-    <ds:schemaRef ds:uri="http://schemas.microsoft.com/office/infopath/2007/PartnerControls"/>
-    <ds:schemaRef ds:uri="http://schemas.microsoft.com/sharepoint/v3"/>
-    <ds:schemaRef ds:uri="38de0ec0-4312-429b-9ba4-a6f7899b86f2"/>
-    <ds:schemaRef ds:uri="21705155-b4ce-4c69-95dc-4fd6cb8c5571"/>
-  </ds:schemaRefs>
-</ds:datastoreItem>
-</file>
-
-<file path=customXml/itemProps2.xml><?xml version="1.0" encoding="utf-8"?>
 <ds:datastoreItem xmlns:ds="http://schemas.openxmlformats.org/officeDocument/2006/customXml" ds:itemID="{9BD05735-5838-4BC3-A10C-F26CBB585BB3}">
   <ds:schemaRefs>
     <ds:schemaRef ds:uri="http://schemas.microsoft.com/office/2006/metadata/contentType"/>
@@ -22182,6 +21815,18 @@
 </ds:datastoreItem>
 </file>
 
+<file path=customXml/itemProps2.xml><?xml version="1.0" encoding="utf-8"?>
+<ds:datastoreItem xmlns:ds="http://schemas.openxmlformats.org/officeDocument/2006/customXml" ds:itemID="{1B72C47D-52A6-4002-B691-BB8C99CF8F2B}">
+  <ds:schemaRefs>
+    <ds:schemaRef ds:uri="http://schemas.microsoft.com/office/2006/metadata/properties"/>
+    <ds:schemaRef ds:uri="http://schemas.microsoft.com/office/infopath/2007/PartnerControls"/>
+    <ds:schemaRef ds:uri="http://schemas.microsoft.com/sharepoint/v3"/>
+    <ds:schemaRef ds:uri="38de0ec0-4312-429b-9ba4-a6f7899b86f2"/>
+    <ds:schemaRef ds:uri="21705155-b4ce-4c69-95dc-4fd6cb8c5571"/>
+  </ds:schemaRefs>
+</ds:datastoreItem>
+</file>
+
 <file path=customXml/itemProps3.xml><?xml version="1.0" encoding="utf-8"?>
 <ds:datastoreItem xmlns:ds="http://schemas.openxmlformats.org/officeDocument/2006/customXml" ds:itemID="{F4A0FC96-E078-42F3-AEDD-07621D6CE88A}">
   <ds:schemaRefs>

</xml_diff>